<commit_message>
docs: synchronize Phase 1 thesis artifacts
Update the ontology, scoring, evaluation and annotation contracts, synchronize the revised report and diagram, and include the review evidence and audit tools.
</commit_message>
<xml_diff>
--- a/chỉnh sửa mới nhất - 01-10/Bao_cao_Phase_1_Ontology_WFKG_ban_chot_da_dong_bo_hieu_dinh.docx
+++ b/chỉnh sửa mới nhất - 01-10/Bao_cao_Phase_1_Ontology_WFKG_ban_chot_da_dong_bo_hieu_dinh.docx
@@ -214,7 +214,7 @@
           <w:rFonts w:ascii="Times New Roman" w:hAnsi="Times New Roman" w:cs="Times New Roman" w:eastAsia="Times New Roman"/>
           <w:sz w:val="26"/>
         </w:rPr>
-        <w:t>RQ3 – Weighting và ranking: Trên cùng tập Candidate của KG đầy đủ, so sánh unweighted KG và weighted KG tại inferenceCutoff bằng candidateScore; market reaction chỉ được phân tích hồi cứu sau khi window đóng bằng reactionWeight. Khi nhiều path cùng một Event–Stock, gom candidateScore/reactionWeight bằng max theo quy tắc đã khóa, không cộng lặp CAR. Đánh giá nDCG@5/@10 theo nhãn chuyên gia 0/1/2, Precision@K và ablation từng thành phần. Nhãn phải độc lập với công thức score để tránh đánh giá vòng tròn.</w:t>
+        <w:t xml:space="preserve">RQ3 – Weighting và ranking: Trên cùng tập Candidate của KG đầy đủ, so sánh unweighted KG và weighted KG tại inferenceCutoff bằng candidateScore; market reaction chỉ được phân tích hồi cứu sau khi window đóng bằng reactionWeight. Khi nhiều path cùng một Event–Stock, gom candidateScore/reactionWeight bằng max theo quy tắc đã khóa, không cộng lặp CAR. Đánh giá nDCG@5/@10 theo nhãn chuyên gia 0/1/2, Precision@K và ba ablation riêng cho extractionConfidence, linkingConfidence và relationConfidence (mỗi lần chỉ thay một component bằng 1; sourceConfidence luôn giữ 0,5). Nhãn phải độc lập với công thức score để tránh đánh giá vòng tròn.</w:t>
       </w:r>
     </w:p>
     <w:p xmlns:wp14="http://schemas.microsoft.com/office/word/2010/wordml" wp14:textId="77777777">
@@ -228,7 +228,7 @@
           <w:rFonts w:ascii="Times New Roman" w:hAnsi="Times New Roman" w:cs="Times New Roman" w:eastAsia="Times New Roman"/>
           <w:sz w:val="26"/>
         </w:rPr>
-        <w:t>Evaluation Phase 2 sẽ đánh giá RQ1 bằng Evidence span, event type/required-role extraction, entity linking, canonicalization theo cặp mention và phân loại quan hệ Event–Event; metric chi tiết, universe cặp và cách xử lý nhãn NONE/multi-label theo EVALUATION_PROTOCOL.md. RQ2 so sánh keyword/co-occurrence, DIRECT-only và KG bốn đường trên cùng Event universe, Stock universe và cutoff. RQ3 so sánh unweighted với candidateScore tại inferenceCutoff; reactionWeight chỉ dùng phân tích sau khi window đóng. Các kết quả synthetic trong báo cáo không phải kết quả đánh giá RQ.</w:t>
+        <w:t>Evaluation Phase 2 đánh giá RQ1 bằng Evidence span, event type/required roles, entity linking, canonicalization và quan hệ Event–Event theo hai tầng bắt buộc: gán assertion trực tiếp có Evidence, rồi kiểm tra OWL suy luận và graph cuối cùng. Contradicts đối xứng; metric ngữ nghĩa cuối quy hai chiều về một cặp Event không có thứ tự, tránh đếm lặp. Updates/clarifies/supersedes vẫn có hướng. Universe, NONE và multi-label theo EVALUATION_PROTOCOL.md. RQ2 so sánh keyword/co-occurrence, DIRECT-only và KG bốn đường trên cùng Event/Stock universe và cutoff. RQ3 so sánh unweighted với candidateScore tại inferenceCutoff; reactionWeight chỉ hậu nghiệm. Synthetic không phải kết quả RQ.</w:t>
       </w:r>
     </w:p>
     <w:p>
@@ -310,7 +310,7 @@
           <w:rFonts w:ascii="Times New Roman" w:hAnsi="Times New Roman" w:cs="Times New Roman" w:eastAsia="Times New Roman"/>
           <w:sz w:val="26"/>
         </w:rPr>
-        <w:t>Ontology gồm 22 lớp: 18 lớp nghiệp vụ và 4 lớp biểu diễn quan hệ theo thời gian. Bank là lớp con của Company. Tên thống nhất là WFKG; namespace wfkg: &lt;https://example.org/wfkg/v1#&gt;. Trong gói này, ontology_v1.0.ttl và shapes_v1.0.ttl là nguồn chuẩn về schema; bảng trong báo cáo được rà theo các contract đó. Folder hiện không có script đồng bộ/audit, nên không khẳng định có thể tái chạy tự động để dựng bảng hoặc Draw.io.</w:t>
+        <w:t xml:space="preserve">Ontology gồm 22 lớp: 18 lớp nghiệp vụ và 4 lớp biểu diễn quan hệ theo thời gian. Bank là lớp con của Company. Tên thống nhất là WFKG; namespace wfkg: &lt;https://example.org/wfkg/v1#&gt;. Trong gói này, ontology_v1.0.ttl và shapes_v1.0.ttl là nguồn chuẩn về schema; bảng trong báo cáo được rà theo các contract đó. Gói có tools/audit_schema_diagram.py và tools/README.md để kiểm tra chỉ đọc sự nhất quán của phụ lục Draw.io với TTL/SHACL. Công cụ không tự sửa hoặc dựng lại bảng, báo cáo hay sơ đồ.</w:t>
       </w:r>
     </w:p>
     <w:tbl>
@@ -5141,7 +5141,7 @@
                 <w:rFonts w:ascii="Times New Roman" w:hAnsi="Times New Roman" w:cs="Times New Roman" w:eastAsia="Times New Roman"/>
                 <w:sz w:val="21"/>
               </w:rPr>
-              <w:t>Hai Event chứa thông tin mâu thuẫn; quan hệ đối xứng, không tự quyết định bên nào đúng.</w:t>
+              <w:t>Hai Event chứa thông tin mâu thuẫn trong cùng bối cảnh; quan hệ đối xứng, không tự quyết định bên nào đúng. Lưu mới→cũ để truy vết; metric ngữ nghĩa cuối dùng một cặp không có thứ tự.</w:t>
             </w:r>
           </w:p>
         </w:tc>
@@ -18615,7 +18615,7 @@
                 <w:rFonts w:ascii="Times New Roman" w:hAnsi="Times New Roman" w:cs="Times New Roman" w:eastAsia="Times New Roman"/>
                 <w:sz w:val="21"/>
               </w:rPr>
-              <w:t>Giữ cả hai Event cùng Evidence; dùng contradicts theo hai chiều về ngữ nghĩa. Không tự chọn thông tin đúng chỉ từ quan hệ này.</w:t>
+              <w:t>Giữ cả hai Event cùng Evidence. Lưu assertion contradicts mới→cũ theo Evidence gốc; OWL-RL suy ra chiều ngược. Kiểm tra cả assertion và suy luận; graph cuối chấm một cặp không có thứ tự, không đếm lặp hai chiều. Quan hệ không tự xác định bên nào đúng.</w:t>
             </w:r>
           </w:p>
         </w:tc>
@@ -18682,7 +18682,7 @@
           <w:rFonts w:ascii="Times New Roman" w:hAnsi="Times New Roman" w:cs="Times New Roman" w:eastAsia="Times New Roman"/>
           <w:sz w:val="26"/>
         </w:rPr>
-        <w:t>updates, clarifies và supersedes có chiều từ Event mang thông tin mới tới Event được tham chiếu. contradicts đối xứng về ngữ nghĩa. Cả bốn là thuộc tính con của relatedEvent; không mặc định bắc cầu và không cho phép tự trỏ về cùng Event. Việc thêm một cạnh không tự xóa, hợp nhất Event hoặc hủy Reaction.</w:t>
+        <w:t>updates, clarifies và supersedes có chiều từ assertion mới tới assertion cũ. contradicts đối xứng về ngữ nghĩa, không xác định bên nào đúng; lưu assertion mới→cũ chỉ để truy vết. Thứ tự lấy từ Evidence gốc, không từ ingestion; nếu bằng nhau/chưa rõ, dùng URI Event tăng dần và ghi cờ trong audit, không suy thành thứ tự thời gian. Giữ assertion trực tiếp tách biệt cạnh OWL-RL suy ra. B contradicts A cho phép A contradicts B, không cho phép suy bắc cầu hay tự trỏ. Cả bốn là thuộc tính con của relatedEvent; không tự xóa/hợp nhất Event hoặc hủy Reaction. Chỉ dùng Events và Evidence của relation đã khả dụng tại cutoff; thông tin đến sau không sửa snapshot cũ.</w:t>
       </w:r>
     </w:p>
     <w:p xmlns:wp14="http://schemas.microsoft.com/office/word/2010/wordml" wp14:textId="77777777">
@@ -19026,7 +19026,7 @@
           <w:rFonts w:ascii="Times New Roman" w:hAnsi="Times New Roman" w:cs="Times New Roman" w:eastAsia="Times New Roman"/>
           <w:sz w:val="26"/>
         </w:rPr>
-        <w:t>TTL/SHACL là nguồn chuẩn khi đối chiếu property và cardinality. Folder hiện không có tools/audit_bundle.py, tools/bundle_validation.json hoặc gói demo đầy đủ để tái chạy kiểm tra tự động; vì vậy các claim kiểm thử được phân biệt với bằng chứng có thể tái lập trong folder. SHACL chỉ xác minh các ràng buộc đã cài đặt, không thay thế kiểm tra calendar, snapshot, completeness, arithmetic hoặc chống trùng nghiệp vụ.</w:t>
+        <w:t xml:space="preserve">TTL/SHACL là nguồn chuẩn khi đối chiếu property và cardinality. Công cụ tools/audit_schema_diagram.py kiểm tra inventory trong phụ lục Draw.io, domain/range của các entry có cấu trúc, cardinality được in trực tiếp theo direct SHACL property shapes, cùng ID/reference của các tab. Property dùng chung không có domain riêng, datatype range không được in và phần diễn giải ngoài phụ lục được ghi NOT CHECKED; không được hiểu là PASS. Công cụ parse SELECT constraints nhưng không thực thi SHACL conformance, không kiểm tra calendar, snapshot, arithmetic runtime hoặc toàn bộ pipeline.</w:t>
       </w:r>
     </w:p>
     <w:p xmlns:wp14="http://schemas.microsoft.com/office/word/2010/wordml" wp14:textId="77777777">
@@ -19417,7 +19417,7 @@
                 <w:rFonts w:ascii="Times New Roman" w:hAnsi="Times New Roman" w:cs="Times New Roman" w:eastAsia="Times New Roman"/>
                 <w:sz w:val="21"/>
               </w:rPr>
-              <w:t>So sánh với baseline không trọng số và ablation</w:t>
+              <w:t>Chỉ phân tích hậu nghiệm sau window. Ranking và ba component ablations áp dụng candidateScore tại cutoff, giữ sourceConfidence = 0,5.</w:t>
             </w:r>
           </w:p>
         </w:tc>
@@ -19456,7 +19456,7 @@
           <w:rFonts w:ascii="Times New Roman" w:hAnsi="Times New Roman" w:cs="Times New Roman" w:eastAsia="Times New Roman"/>
           <w:sz w:val="26"/>
         </w:rPr>
-        <w:t>RQ1 – Extraction và entity linking: Có thể xây dựng một provenance-aware financial KG từ tin tức tiếng Việt với độ chính xác extraction và entity linking như thế nào? Demo minh họa NewsArticle, Evidence, canonical Event, alias và confidence. Phase 2 đánh giá Evidence span (micro P/R/F1 và exact-boundary F1), event type/required roles, entity linking, duplicate canonicalization pairwise P/R/F1 và directed Event relation classification theo EVALUATION_PROTOCOL.md. Các chỉ số này cần gold set đã adjudicate; demo synthetic không cung cấp kết luận định lượng.</w:t>
+        <w:t>RQ1 – Extraction và entity linking: Có thể xây dựng provenance-aware financial KG từ tin tức tiếng Việt với độ chính xác như thế nào? Phase 2 đánh giá Evidence span, event type/required roles, entity linking và duplicate pairwise P/R/F1. Quan hệ Event được kiểm tra ở hai tầng: assertion trực tiếp trên cặp có thứ tự với gold cùng quy ước lưu; OWL-RL trên ontology/snapshot đã đóng băng và chất lượng graph cuối với semantic gold độc lập. Contradicts cuối dùng khóa cặp URI đã sắp xếp, deduplicate hai chiều; các relation còn lại chấm có hướng. Báo metrics/support riêng, không trộn mẫu ordered và unordered. NONE phụ thuộc view; không gán reverse contradiction là semantic-negative, không coi thiếu triple là gold-negative. Gold/universe/negatives phải adjudicate trước prediction; manifest ghi reasoner/version, cutoff, provenance và pair owner bootstrap. OWL có thể suy đúng quy tắc từ assertion sai nên vẫn phải chấm graph cuối; demo synthetic không chứng minh chất lượng RQ.</w:t>
       </w:r>
     </w:p>
     <w:p xmlns:wp14="http://schemas.microsoft.com/office/word/2010/wordml" wp14:textId="77777777">
@@ -19484,7 +19484,7 @@
           <w:rFonts w:ascii="Times New Roman" w:hAnsi="Times New Roman" w:cs="Times New Roman" w:eastAsia="Times New Roman"/>
           <w:sz w:val="26"/>
         </w:rPr>
-        <w:t>RQ3 – Weighting và ranking: Trên cùng tập Candidate của KG đầy đủ, so sánh unweighted KG và weighted KG tại inferenceCutoff bằng candidateScore. Unweighted dùng điểm 1; weighted dùng candidateScore = confidenceScore × relationStrength. Khi nhiều path cùng một Event–Stock, gom candidateScore bằng max theo rule đã khóa, không dùng CAR hoặc reactionWeight để xếp hạng tại inferenceCutoff. Reaction chỉ được phân tích hồi cứu sau khi event window đóng bằng reactionWeight. Đánh giá nDCG@5/@10 theo nhãn chuyên gia 0/1/2, Precision@K, ablation từng thành phần và báo cáo riêng theo impactType cùng macro theo Event. Nhãn phải độc lập với score.</w:t>
+        <w:t xml:space="preserve">RQ3 – Weighting và ranking: Trên cùng tập Candidate của KG đầy đủ, so sánh unweighted KG và weighted KG tại inferenceCutoff bằng candidateScore. Unweighted dùng điểm 1; weighted dùng candidateScore = confidenceScore × relationStrength. Khi nhiều path cùng một Event–Stock, gom candidateScore bằng max theo rule đã khóa, không dùng CAR hoặc reactionWeight để xếp hạng tại inferenceCutoff. Reaction chỉ được phân tích hồi cứu sau khi event window đóng bằng reactionWeight. Đánh giá nDCG@5/@10 theo nhãn chuyên gia 0/1/2, Precision@K, ba ablation riêng cho extractionConfidence, linkingConfidence và relationConfidence (mỗi lần chỉ thay một component bằng 1; sourceConfidence luôn giữ 0,5) và báo cáo riêng theo impactType cùng macro theo Event. Nhãn phải độc lập với score. Ablation trung hòa biến thiên điểm của một component, không khẳng định confidence thực tế bằng 1 và không bỏ bước extraction, linking hay kiểm tra path. Mỗi variant tính lại confidenceScore/candidateScore theo công thức đã khóa, lưu Candidate URI và methodVersion riêng, giữ điểm gốc trong audit record và không ghi đè baseline. Các so sánh dùng cùng Event/Stock universe, cutoff, eligible paths, relationStrength, gold labels và tie-break; chỉ aggregate trong cùng methodVersion. Source-confidence ablation nằm ngoài baseline này.</w:t>
       </w:r>
     </w:p>
     <w:p xmlns:wp14="http://schemas.microsoft.com/office/word/2010/wordml" wp14:textId="77777777">
@@ -19696,7 +19696,7 @@
           <w:rFonts w:ascii="Times New Roman" w:hAnsi="Times New Roman" w:cs="Times New Roman" w:eastAsia="Times New Roman"/>
           <w:sz w:val="26"/>
         </w:rPr>
-        <w:t>Các query dưới đây là competency queries dự kiến cho từng graph snapshot. DOCX nguồn ghi rằng query được chạy bằng RDFLib và có hình minh họa, nhưng folder hiện không có demo/queries, demo/results, demo/test_results.json hoặc tools; vì vậy query, số dòng và nguồn tạo hình chưa thể tái lập độc lập từ gói này. Mọi hình/fixture trong chương này là SYNTHETIC TEST ONLY, không phải bằng chứng định lượng cho RQ1–RQ3.</w:t>
+        <w:t xml:space="preserve">Các query dưới đây là competency queries dự kiến cho từng graph snapshot. DOCX nguồn ghi rằng query được chạy bằng RDFLib và có hình minh họa, nhưng gói hiện không có demo/queries, demo/results hoặc demo/test_results.json để tái chạy và đối chiếu số dòng/nguồn tạo hình. tools/audit_schema_diagram.py chỉ so sánh schema–phụ lục Draw.io, không chạy các competency queries hay dựng demo. Mọi hình/fixture trong chương này là SYNTHETIC TEST ONLY, không phải bằng chứng định lượng cho RQ1–RQ3.</w:t>
       </w:r>
     </w:p>
     <w:p>
@@ -20295,6 +20295,115 @@
     </w:p>
     <w:p>
       <w:pPr>
+        <w:spacing w:line="240" w:lineRule="auto" w:after="0"/>
+        <w:ind w:firstLine="0"/>
+        <w:jc w:val="left"/>
+      </w:pPr>
+      <w:r>
+        <w:rPr>
+          <w:rFonts w:ascii="Consolas" w:hAnsi="Consolas" w:cs="Consolas" w:eastAsia="Consolas"/>
+          <w:sz w:val="17"/>
+        </w:rPr>
+        <w:t>PREFIX wfkg: &lt;https://example.org/wfkg/v1#&gt;</w:t>
+      </w:r>
+    </w:p>
+    <w:p>
+      <w:pPr>
+        <w:spacing w:line="312" w:lineRule="auto" w:after="100"/>
+        <w:jc w:val="both"/>
+      </w:pPr>
+      <w:r>
+        <w:rPr>
+          <w:rFonts w:ascii="Times New Roman" w:hAnsi="Times New Roman" w:cs="Times New Roman" w:eastAsia="Times New Roman"/>
+          <w:sz w:val="26"/>
+        </w:rPr>
+        <w:t>PREFIX xsd: &lt;http://www.w3.org/2001/XMLSchema#&gt;</w:t>
+      </w:r>
+    </w:p>
+    <w:p>
+      <w:pPr>
+        <w:spacing w:line="312" w:lineRule="auto" w:after="100"/>
+        <w:jc w:val="both"/>
+      </w:pPr>
+      <w:r>
+        <w:rPr>
+          <w:rFonts w:ascii="Times New Roman" w:hAnsi="Times New Roman" w:cs="Times New Roman" w:eastAsia="Times New Roman"/>
+          <w:sz w:val="26"/>
+        </w:rPr>
+        <w:t>SELECT ?cutoff ?articleId ?articleAvailableAt ?evidenceId ?evidenceAvailableAt ?eventId ?eventAvailableAt WHERE {</w:t>
+      </w:r>
+    </w:p>
+    <w:p>
+      <w:pPr>
+        <w:spacing w:line="312" w:lineRule="auto" w:after="100"/>
+        <w:jc w:val="both"/>
+      </w:pPr>
+      <w:r>
+        <w:rPr>
+          <w:rFonts w:ascii="Times New Roman" w:hAnsi="Times New Roman" w:cs="Times New Roman" w:eastAsia="Times New Roman"/>
+          <w:sz w:val="26"/>
+        </w:rPr>
+        <w:t xml:space="preserve"> VALUES ?cutoff {"2026-08-26T14:16:00+07:00"^^xsd:dateTime "2026-08-26T16:16:00+07:00"^^xsd:dateTime}</w:t>
+      </w:r>
+    </w:p>
+    <w:p>
+      <w:pPr>
+        <w:spacing w:line="312" w:lineRule="auto" w:after="100"/>
+        <w:ind w:firstLine="562"/>
+        <w:jc w:val="both"/>
+      </w:pPr>
+      <w:r>
+        <w:rPr>
+          <w:rFonts w:ascii="Times New Roman" w:hAnsi="Times New Roman" w:cs="Times New Roman" w:eastAsia="Times New Roman"/>
+          <w:sz w:val="26"/>
+        </w:rPr>
+        <w:t xml:space="preserve"> ?a wfkg:articleId ?articleId; wfkg:availableAt ?articleAvailableAt; wfkg:reports ?e .</w:t>
+      </w:r>
+    </w:p>
+    <w:p>
+      <w:pPr>
+        <w:spacing w:line="312" w:lineRule="auto" w:after="100"/>
+        <w:ind w:firstLine="562"/>
+        <w:jc w:val="both"/>
+      </w:pPr>
+      <w:r>
+        <w:rPr>
+          <w:rFonts w:ascii="Times New Roman" w:hAnsi="Times New Roman" w:cs="Times New Roman" w:eastAsia="Times New Roman"/>
+          <w:sz w:val="26"/>
+        </w:rPr>
+        <w:t xml:space="preserve"> ?v wfkg:evidenceId ?evidenceId; wfkg:extractedFrom ?a; wfkg:supports ?e; wfkg:availableAt ?evidenceAvailableAt .</w:t>
+      </w:r>
+    </w:p>
+    <w:p>
+      <w:pPr>
+        <w:spacing w:line="312" w:lineRule="auto" w:after="100"/>
+        <w:ind w:firstLine="562"/>
+        <w:jc w:val="both"/>
+      </w:pPr>
+      <w:r>
+        <w:rPr>
+          <w:rFonts w:ascii="Times New Roman" w:hAnsi="Times New Roman" w:cs="Times New Roman" w:eastAsia="Times New Roman"/>
+          <w:sz w:val="26"/>
+        </w:rPr>
+        <w:t xml:space="preserve"> ?e wfkg:eventId ?eventId; wfkg:availableAt ?eventAvailableAt .</w:t>
+      </w:r>
+    </w:p>
+    <w:p>
+      <w:pPr>
+        <w:spacing w:line="312" w:lineRule="auto" w:after="100"/>
+        <w:ind w:firstLine="562"/>
+        <w:jc w:val="both"/>
+      </w:pPr>
+      <w:r>
+        <w:rPr>
+          <w:rFonts w:ascii="Times New Roman" w:hAnsi="Times New Roman" w:cs="Times New Roman" w:eastAsia="Times New Roman"/>
+          <w:sz w:val="26"/>
+        </w:rPr>
+        <w:t xml:space="preserve"> FILTER(?articleAvailableAt &lt;= ?cutoff &amp;&amp; ?evidenceAvailableAt &lt;= ?cutoff &amp;&amp; ?eventAvailableAt &lt;= ?cutoff)</w:t>
+      </w:r>
+    </w:p>
+    <w:p>
+      <w:pPr>
         <w:spacing w:line="312" w:lineRule="auto" w:after="100"/>
         <w:jc w:val="both"/>
       </w:pPr>
@@ -20304,115 +20413,6 @@
           <w:sz w:val="26"/>
         </w:rPr>
         <w:t>} ORDER BY ?cutoff ?articleAvailableAt ?evidenceAvailableAt ?articleId ?evidenceId</w:t>
-      </w:r>
-    </w:p>
-    <w:p>
-      <w:pPr>
-        <w:spacing w:line="312" w:lineRule="auto" w:after="100"/>
-        <w:ind w:firstLine="562"/>
-        <w:jc w:val="both"/>
-      </w:pPr>
-      <w:r>
-        <w:rPr>
-          <w:rFonts w:ascii="Times New Roman" w:hAnsi="Times New Roman" w:cs="Times New Roman" w:eastAsia="Times New Roman"/>
-          <w:sz w:val="26"/>
-        </w:rPr>
-        <w:t xml:space="preserve"> FILTER(?articleAvailableAt &lt;= ?cutoff &amp;&amp; ?evidenceAvailableAt &lt;= ?cutoff &amp;&amp; ?eventAvailableAt &lt;= ?cutoff)</w:t>
-      </w:r>
-    </w:p>
-    <w:p>
-      <w:pPr>
-        <w:spacing w:line="312" w:lineRule="auto" w:after="100"/>
-        <w:ind w:firstLine="562"/>
-        <w:jc w:val="both"/>
-      </w:pPr>
-      <w:r>
-        <w:rPr>
-          <w:rFonts w:ascii="Times New Roman" w:hAnsi="Times New Roman" w:cs="Times New Roman" w:eastAsia="Times New Roman"/>
-          <w:sz w:val="26"/>
-        </w:rPr>
-        <w:t xml:space="preserve"> ?e wfkg:eventId ?eventId; wfkg:availableAt ?eventAvailableAt .</w:t>
-      </w:r>
-    </w:p>
-    <w:p>
-      <w:pPr>
-        <w:spacing w:line="312" w:lineRule="auto" w:after="100"/>
-        <w:ind w:firstLine="562"/>
-        <w:jc w:val="both"/>
-      </w:pPr>
-      <w:r>
-        <w:rPr>
-          <w:rFonts w:ascii="Times New Roman" w:hAnsi="Times New Roman" w:cs="Times New Roman" w:eastAsia="Times New Roman"/>
-          <w:sz w:val="26"/>
-        </w:rPr>
-        <w:t xml:space="preserve"> ?v wfkg:evidenceId ?evidenceId; wfkg:extractedFrom ?a; wfkg:supports ?e; wfkg:availableAt ?evidenceAvailableAt .</w:t>
-      </w:r>
-    </w:p>
-    <w:p>
-      <w:pPr>
-        <w:spacing w:line="312" w:lineRule="auto" w:after="100"/>
-        <w:ind w:firstLine="562"/>
-        <w:jc w:val="both"/>
-      </w:pPr>
-      <w:r>
-        <w:rPr>
-          <w:rFonts w:ascii="Times New Roman" w:hAnsi="Times New Roman" w:cs="Times New Roman" w:eastAsia="Times New Roman"/>
-          <w:sz w:val="26"/>
-        </w:rPr>
-        <w:t xml:space="preserve"> ?a wfkg:articleId ?articleId; wfkg:availableAt ?articleAvailableAt; wfkg:reports ?e .</w:t>
-      </w:r>
-    </w:p>
-    <w:p>
-      <w:pPr>
-        <w:spacing w:line="312" w:lineRule="auto" w:after="100"/>
-        <w:jc w:val="both"/>
-      </w:pPr>
-      <w:r>
-        <w:rPr>
-          <w:rFonts w:ascii="Times New Roman" w:hAnsi="Times New Roman" w:cs="Times New Roman" w:eastAsia="Times New Roman"/>
-          <w:sz w:val="26"/>
-        </w:rPr>
-        <w:t xml:space="preserve"> VALUES ?cutoff {"2026-08-26T14:16:00+07:00"^^xsd:dateTime "2026-08-26T16:16:00+07:00"^^xsd:dateTime}</w:t>
-      </w:r>
-    </w:p>
-    <w:p>
-      <w:pPr>
-        <w:spacing w:line="312" w:lineRule="auto" w:after="100"/>
-        <w:jc w:val="both"/>
-      </w:pPr>
-      <w:r>
-        <w:rPr>
-          <w:rFonts w:ascii="Times New Roman" w:hAnsi="Times New Roman" w:cs="Times New Roman" w:eastAsia="Times New Roman"/>
-          <w:sz w:val="26"/>
-        </w:rPr>
-        <w:t>SELECT ?cutoff ?articleId ?articleAvailableAt ?evidenceId ?evidenceAvailableAt ?eventId ?eventAvailableAt WHERE {</w:t>
-      </w:r>
-    </w:p>
-    <w:p>
-      <w:pPr>
-        <w:spacing w:line="312" w:lineRule="auto" w:after="100"/>
-        <w:jc w:val="both"/>
-      </w:pPr>
-      <w:r>
-        <w:rPr>
-          <w:rFonts w:ascii="Times New Roman" w:hAnsi="Times New Roman" w:cs="Times New Roman" w:eastAsia="Times New Roman"/>
-          <w:sz w:val="26"/>
-        </w:rPr>
-        <w:t>PREFIX xsd: &lt;http://www.w3.org/2001/XMLSchema#&gt;</w:t>
-      </w:r>
-    </w:p>
-    <w:p>
-      <w:pPr>
-        <w:spacing w:line="240" w:lineRule="auto" w:after="0"/>
-        <w:ind w:firstLine="0"/>
-        <w:jc w:val="left"/>
-      </w:pPr>
-      <w:r>
-        <w:rPr>
-          <w:rFonts w:ascii="Consolas" w:hAnsi="Consolas" w:cs="Consolas" w:eastAsia="Consolas"/>
-          <w:sz w:val="17"/>
-        </w:rPr>
-        <w:t>PREFIX wfkg: &lt;https://example.org/wfkg/v1#&gt;</w:t>
       </w:r>
     </w:p>
     <w:p>
@@ -22262,7 +22262,7 @@
           <w:rFonts w:ascii="Times New Roman" w:hAnsi="Times New Roman" w:cs="Times New Roman" w:eastAsia="Times New Roman"/>
           <w:sz w:val="26"/>
         </w:rPr>
-        <w:t>File đánh giá góp ý ghi nhận các kiểm thử fixture/schema đã chạy trước đó: Reaction 9/9 và Candidate 7/7 theo kỳ vọng. Tuy nhiên, demo/test_results.json, tools/test_contracts.py và tools/audit_bundle.py không có trong folder này nên em không thể chạy lại hoặc đối chiếu từng assertion từ gói hiện tại. Đây là kết quả synthetic được ghi nhận trong Danh_gia_gop_y_phase1_truoc_code_phase2_2026-10-01.md, không phải đánh giá NLP, pipeline ứng dụng hoặc RQ1–RQ3.</w:t>
+        <w:t xml:space="preserve">Kiểm tra có thể tái chạy từ gói hiện tại là audit chỉ đọc bằng tools/audit_schema_diagram.py. Kết quả trên bộ artifact hiện tại: 336 assertion PASS, 0 FAIL và 57 NOT CHECKED; exit code 0. Công cụ parse được 38 SELECT constraints và xác nhận SHA256 của ba file đầu vào không đổi trước/sau. Các con số là số assertion có phạm vi, không phải số góp ý đã hoàn tất hoặc tỷ lệ coverage. Kết quả kiểm thử fixture/schema lịch sử không được dùng làm bằng chứng tái lập của gói này khi thiếu fixture, runner và log tương ứng. Audit không chứng minh behavioral SHACL conformance, AR/CAR trên dữ liệu thật, NLP hoặc RQ1–RQ3; layout trực quan chưa được xác minh.</w:t>
       </w:r>
     </w:p>
     <w:p xmlns:wp14="http://schemas.microsoft.com/office/word/2010/wordml" wp14:textId="77777777">
@@ -22298,7 +22298,7 @@
           <w:rFonts w:ascii="Times New Roman" w:hAnsi="Times New Roman" w:cs="Times New Roman" w:eastAsia="Times New Roman"/>
           <w:sz w:val="26"/>
         </w:rPr>
-        <w:t>Bản nguồn ghi các lệnh dự kiến cho full project checkout: python tools/test_contracts.py, python tools/build_demo.py, python tools/sync_report.py, python tools/sync_diagram.py, python tools/render_diagram.py, python tools/export_report.py và python tools/audit_bundle.py. Các script, demo/README.md và output không có trong folder được rà, nên không thể coi riêng folder này là gói tái lập hoặc tuyên bố các lệnh trên đã chạy ở đây. Query 5 được thiết kế cho snapshot pending; query còn lại dùng graph snapshot được chỉ định. Runner nguồn giới hạn window [0,0] và calendar fixture; calendar thị trường thật, NLP, multi-window và thực nghiệm RQ thuộc Phase 2.</w:t>
+        <w:t xml:space="preserve">Từ folder chứa TTL/SHACL/Draw.io, chạy python tools/audit_schema_diagram.py; thêm --verbose để xem chi tiết PASS hoặc --json để in JSON ra stdout. Dependency và giới hạn kiểm tra nằm trong tools/README.md. Script trả 0 nếu không phát hiện FAIL trong phạm vi hỗ trợ (vẫn có thể có NOT CHECKED), 1 nếu có khác biệt và 2 nếu không hoàn tất do lỗi input/định dạng/parser. Script không ghi lại artifact hoặc tự tạo file kết quả. Các demo query vẫn cần graph snapshot và runner riêng: Query 5 dành cho snapshot pending, query còn lại dùng snapshot được chỉ định. Gói này không phải pipeline demo/evaluation hoàn chỉnh; calendar thị trường thật, NLP, multi-window và thực nghiệm RQ thuộc Phase 2.</w:t>
       </w:r>
     </w:p>
     <w:p>
@@ -22450,7 +22450,7 @@
                 <w:rFonts w:ascii="Times New Roman" w:hAnsi="Times New Roman" w:cs="Times New Roman" w:eastAsia="Times New Roman"/>
                 <w:sz w:val="21"/>
               </w:rPr>
-              <w:t>Báo cáo hiệu đính đã thống nhất relationPath theo schema/SHACL. Draw.io hiện vẫn có câu trái ngược ở tab 05-4; file sơ đồ cần được sửa riêng.</w:t>
+              <w:t>Draw.io tab 05-4 đã ghi relationPath = impactType theo baseline 1.0.2. Audit chỉ đọc đối chiếu phụ lục với TTL/SHACL; không thay thế review các tab diễn giải hoặc kiểm tra layout.</w:t>
             </w:r>
           </w:p>
         </w:tc>
@@ -22568,7 +22568,7 @@
                 <w:rFonts w:ascii="Times New Roman" w:hAnsi="Times New Roman" w:cs="Times New Roman" w:eastAsia="Times New Roman"/>
                 <w:sz w:val="21"/>
               </w:rPr>
-              <w:t>Contract 1.0.2 được giữ theo các spec trong folder. File đánh giá ghi nhận kiểm thử tổng hợp; raw graph/log/script không có trong folder nên chưa tái xác minh được end-to-end.</w:t>
+              <w:t xml:space="preserve">Đặc tả 1.0.2 có confidence components và freeze rule. Audit đối chiếu các property có cấu trúc trong appendix; không kiểm chứng calibration, snapshot immutability hoặc behavior của constraint confidence trên fixture.</w:t>
             </w:r>
           </w:p>
         </w:tc>
@@ -22627,7 +22627,7 @@
                 <w:rFonts w:ascii="Times New Roman" w:hAnsi="Times New Roman" w:cs="Times New Roman" w:eastAsia="Times New Roman"/>
                 <w:sz w:val="21"/>
               </w:rPr>
-              <w:t>Contract 1.0.2 được giữ theo các spec trong folder. File đánh giá ghi nhận kiểm thử tổng hợp; raw graph/log/script không có trong folder nên chưa tái xác minh được end-to-end.</w:t>
+              <w:t xml:space="preserve">Đặc tả tách inference score và post-window score. Audit kiểm tra property inventory/ownership có khai báo; không thực thi phép tính score hoặc kiểm thử chống leakage của ranker.</w:t>
             </w:r>
           </w:p>
         </w:tc>
@@ -22686,7 +22686,7 @@
                 <w:rFonts w:ascii="Times New Roman" w:hAnsi="Times New Roman" w:cs="Times New Roman" w:eastAsia="Times New Roman"/>
                 <w:sz w:val="21"/>
               </w:rPr>
-              <w:t>Contract 1.0.2 được giữ theo các spec trong folder. File đánh giá ghi nhận kiểm thử tổng hợp; raw graph/log/script không có trong folder nên chưa tái xác minh được end-to-end.</w:t>
+              <w:t xml:space="preserve">Đặc tả có stock/index observations và provenance. Audit đối chiếu các endpoint/cardinality được biểu diễn trong appendix; sourceReference chỉ được name coverage nếu không có entry có cấu trúc. Chưa chạy behavioral tests về coverage hoặc return/AR/CAR trên dữ liệu thật.</w:t>
             </w:r>
           </w:p>
         </w:tc>
@@ -22745,7 +22745,7 @@
                 <w:rFonts w:ascii="Times New Roman" w:hAnsi="Times New Roman" w:cs="Times New Roman" w:eastAsia="Times New Roman"/>
                 <w:sz w:val="21"/>
               </w:rPr>
-              <w:t>Contract 1.0.2 được giữ theo các spec trong folder. File đánh giá ghi nhận kiểm thử tổng hợp; raw graph/log/script không có trong folder nên chưa tái xác minh được end-to-end.</w:t>
+              <w:t xml:space="preserve">EVENT_DICTIONARY.yaml là nguồn dictionary trong gói. Audit schema–diagram không kiểm tra chất lượng annotation, extraction hoặc event identity; không dùng kết quả synthetic lịch sử làm bằng chứng đánh giá NLP.</w:t>
             </w:r>
           </w:p>
         </w:tc>
@@ -22804,7 +22804,7 @@
                 <w:rFonts w:ascii="Times New Roman" w:hAnsi="Times New Roman" w:cs="Times New Roman" w:eastAsia="Times New Roman"/>
                 <w:sz w:val="21"/>
               </w:rPr>
-              <w:t>Contract 1.0.2 được giữ theo các spec trong folder. File đánh giá ghi nhận kiểm thử tổng hợp; raw graph/log/script không có trong folder nên chưa tái xác minh được end-to-end.</w:t>
+              <w:t xml:space="preserve">Audit đối chiếu reports [0..*] với direct SHACL cardinality trong appendix. Latest eligible exposure, staleness và curated gate là rule đặc tả; chưa kiểm chứng bằng pipeline/calendar thực tế.</w:t>
             </w:r>
           </w:p>
         </w:tc>
@@ -22863,7 +22863,7 @@
                 <w:rFonts w:ascii="Times New Roman" w:hAnsi="Times New Roman" w:cs="Times New Roman" w:eastAsia="Times New Roman"/>
                 <w:sz w:val="21"/>
               </w:rPr>
-              <w:t>Contract 1.0.2 được giữ theo các spec trong folder. File đánh giá ghi nhận kiểm thử tổng hợp; raw graph/log/script không có trong folder nên chưa tái xác minh được end-to-end.</w:t>
+              <w:t xml:space="preserve">Protocol nằm trong EVALUATION_PROTOCOL.md và ANNOTATION_GUIDELINE.md. Ba component ablations giữ sourceConfidence = 0,5. Audit không thực thi dataset split, metric, bootstrap hoặc đánh giá RQ; các bước đó thuộc Phase 2.</w:t>
             </w:r>
           </w:p>
         </w:tc>
@@ -22922,7 +22922,7 @@
                 <w:rFonts w:ascii="Times New Roman" w:hAnsi="Times New Roman" w:cs="Times New Roman" w:eastAsia="Times New Roman"/>
                 <w:sz w:val="21"/>
               </w:rPr>
-              <w:t>Báo cáo này mô tả contract; Draw.io chưa được sửa trong lượt này và vẫn còn câu mâu thuẫn về relationPath. Không kết luận artifact đã đồng bộ hoàn toàn.</w:t>
+              <w:t>Draw.io đã được sửa các route và relationPath đã xác định. Gói có tools/audit_schema_diagram.py và README; audit phụ lục không phát hiện khác biệt trong phạm vi hỗ trợ. Các mục NOT CHECKED và visual verification được báo riêng.</w:t>
             </w:r>
           </w:p>
         </w:tc>
@@ -23012,7 +23012,7 @@
           <w:rFonts w:ascii="Times New Roman" w:hAnsi="Times New Roman" w:cs="Times New Roman" w:eastAsia="Times New Roman"/>
           <w:sz w:val="26"/>
         </w:rPr>
-        <w:t>Các đường suy luận ngoài bốn baseline phải được đánh dấu rõ: FUTURE EXTENSION — NOT IMPLEMENTED IN PHASE 2 BASELINE. Draw.io trong folder hiện vẫn có câu ‘Bốn impactType khác nhau ở relationPath’, trái với contract 1.0.2; file sơ đồ không được sửa trong lượt tạo bản báo cáo này và cần cập nhật riêng.</w:t>
+        <w:t>Các đường suy luận ngoài bốn baseline phải được đánh dấu rõ: FUTURE EXTENSION — NOT IMPLEMENTED IN PHASE 2 BASELINE. Trong baseline 1.0.2, relationPath phải bằng impactType. Draw.io được đối chiếu theo contract TTL/SHACL và chỉ minh họa bốn baseline path; TTL/SHACL vẫn là source of truth.</w:t>
       </w:r>
     </w:p>
     <w:p>

</xml_diff>

<commit_message>
docs(thesis): finalize Phase 1 contract 1.0.4 and verification artifacts
</commit_message>
<xml_diff>
--- a/chỉnh sửa mới nhất - 01-10/Bao_cao_Phase_1_Ontology_WFKG_ban_chot_da_dong_bo_hieu_dinh.docx
+++ b/chỉnh sửa mới nhất - 01-10/Bao_cao_Phase_1_Ontology_WFKG_ban_chot_da_dong_bo_hieu_dinh.docx
@@ -216,6 +216,9 @@
         </w:rPr>
         <w:t xml:space="preserve">RQ3 – Weighting và ranking: Trên cùng tập Candidate của KG đầy đủ, so sánh unweighted KG và weighted KG tại inferenceCutoff bằng candidateScore; market reaction chỉ được phân tích hồi cứu sau khi window đóng bằng reactionWeight. Khi nhiều path cùng một Event–Stock, gom candidateScore/reactionWeight bằng max theo quy tắc đã khóa, không cộng lặp CAR. Đánh giá nDCG@5/@10 theo nhãn chuyên gia 0/1/2, Precision@K và ba ablation riêng cho extractionConfidence, linkingConfidence và relationConfidence (mỗi lần chỉ thay một component bằng 1; sourceConfidence luôn giữ 0,5). Nhãn phải độc lập với công thức score để tránh đánh giá vòng tròn.</w:t>
       </w:r>
+      <w:r>
+        <w:t xml:space="preserve"> Per-impactType phải chiếu predictions theo route trước aggregation/top-K, không lọc bằng gold sau dự đoán; common universe và nhãn độc lập được khóa trong EVALUATION_PROTOCOL.md.</w:t>
+      </w:r>
     </w:p>
     <w:p xmlns:wp14="http://schemas.microsoft.com/office/word/2010/wordml" wp14:textId="77777777">
       <w:pPr>
@@ -311,6 +314,9 @@
           <w:sz w:val="26"/>
         </w:rPr>
         <w:t xml:space="preserve">Ontology gồm 22 lớp: 18 lớp nghiệp vụ và 4 lớp biểu diễn quan hệ theo thời gian. Bank là lớp con của Company. Tên thống nhất là WFKG; namespace wfkg: &lt;https://example.org/wfkg/v1#&gt;. Trong gói này, ontology_v1.0.ttl và shapes_v1.0.ttl là nguồn chuẩn về schema; bảng trong báo cáo được rà theo các contract đó. Gói có tools/audit_schema_diagram.py và tools/README.md để kiểm tra chỉ đọc sự nhất quán của phụ lục Draw.io với TTL/SHACL. Công cụ không tự sửa hoặc dựng lại bảng, báo cáo hay sơ đồ.</w:t>
+      </w:r>
+      <w:r>
+        <w:t xml:space="preserve"> Phiên bản contract hiện hành là 1.0.4; giữ nguyên tên ontology_v1.0.ttl và shapes_v1.0.ttl, namespace và 22 lớp. Phiên bản tăng để không gán quy tắc mới cho kết quả snapshot cũ.</w:t>
       </w:r>
     </w:p>
     <w:tbl>
@@ -1328,7 +1334,7 @@
           <w:rFonts w:ascii="Times New Roman" w:hAnsi="Times New Roman" w:cs="Times New Roman" w:eastAsia="Times New Roman"/>
           <w:sz w:val="26"/>
         </w:rPr>
-        <w:t>Các tình huống ngành, chính sách và doanh nghiệp đều phải đi qua quy tắc liên kết được định phiên bản; không tự coi các doanh nghiệp cùng ngành là có exposure bằng nhau. Các mở rộng đường liên hệ được đánh giá ở Phase 2. Trong baseline 1.0.2, relationPath là mã route ổn định và phải bằng impactType; các mũi tên trong bảng chỉ mô tả topology. Không lưu chuỗi URI/property/phiên bản quan hệ vào relationPath; candidateReason giải thích việc chọn Candidate, còn các quan hệ và provenance được biểu diễn bằng liên kết RDF và relation node tương ứng.</w:t>
+        <w:t>Các tình huống ngành, chính sách và doanh nghiệp đều phải đi qua quy tắc liên kết được định phiên bản; không tự coi các doanh nghiệp cùng ngành là có exposure bằng nhau. Các mở rộng đường liên hệ được đánh giá ở Phase 2. Trong baseline 1.0.4, relationPath là mã route ổn định và phải bằng impactType; các mũi tên trong bảng chỉ mô tả topology. Không lưu chuỗi URI/property/phiên bản quan hệ vào relationPath; candidateReason giải thích việc chọn Candidate, còn các quan hệ và provenance được biểu diễn bằng liên kết RDF và relation node tương ứng.</w:t>
       </w:r>
     </w:p>
     <w:p xmlns:wp14="http://schemas.microsoft.com/office/word/2010/wordml" wp14:textId="77777777">
@@ -6775,7 +6781,7 @@
                 <w:rFonts w:ascii="Times New Roman" w:hAnsi="Times New Roman" w:cs="Times New Roman" w:eastAsia="Times New Roman"/>
                 <w:sz w:val="21"/>
               </w:rPr>
-              <w:t>Các node quan hệ trong đó Company này là subsidiaryCompany.</w:t>
+              <w:t>Các node quan hệ trong đó Company này là parentCompany (công ty mẹ). SubsidiaryRelation trỏ lại mẹ bằng parentCompany và xác định công ty con bằng subsidiaryCompany.</w:t>
             </w:r>
           </w:p>
         </w:tc>
@@ -11851,7 +11857,7 @@
                 <w:rFonts w:ascii="Times New Roman" w:hAnsi="Times New Roman" w:cs="Times New Roman" w:eastAsia="Times New Roman"/>
                 <w:sz w:val="21"/>
               </w:rPr>
-              <w:t>Độ mạnh đường liên hệ trong [0,1]; baseline heuristic, độc lập với phản ứng giá quan sát.</w:t>
+              <w:t>Baseline: DIRECT=1; INDIRECT_INDUSTRY=0,5; INDIRECT_SUBSIDIARY=0,5; INDIRECT_LEADERSHIP=0,5. Đây là heuristic độc lập market reaction. Biến thể industry dùng exposureStrength=exposureRatio đã chuẩn hóa trên cùng tập exposure hợp lệ.</w:t>
             </w:r>
           </w:p>
         </w:tc>
@@ -12085,7 +12091,7 @@
                 <w:rFonts w:ascii="Times New Roman" w:hAnsi="Times New Roman" w:cs="Times New Roman" w:eastAsia="Times New Roman"/>
                 <w:sz w:val="21"/>
               </w:rPr>
-              <w:t>Mốc thông tin dùng để sinh Candidate. Chỉ dùng Evidence, dữ liệu và phiên bản quan hệ đã khả dụng tại mốc này.</w:t>
+              <w:t>Baseline 1.0.4 khóa inferenceCutoff = Event.availableAt, trước opening day 0. Chỉ dùng Evidence, dữ liệu và phiên bản quan hệ đã khả dụng tại mốc này. generatedAt có thể muộn hơn khi replay, nhưng không được lấy thêm thông tin sau cutoff.</w:t>
             </w:r>
           </w:p>
         </w:tc>
@@ -12709,7 +12715,7 @@
                 <w:rFonts w:ascii="Times New Roman" w:hAnsi="Times New Roman" w:cs="Times New Roman" w:eastAsia="Times New Roman"/>
                 <w:sz w:val="21"/>
               </w:rPr>
-              <w:t>Điểm extractor cho Event/Evidence; cố định theo snapshot. Điểm heuristic không được gọi là xác suất calibrated.</w:t>
+              <w:t>Maximum điểm Evidence đủ điều kiện tại cutoff và hỗ trợ đầy đủ required roles; tie-break Evidence URI tăng dần. Nếu chỉ có điểm theo role thì lấy minimum cho một assignment. Thiếu calibration dùng fallback 0,5 có provenance; thiếu required role thì loại. Freeze Evidence được chọn và điểm gốc; không cộng điểm nhiều bài.</w:t>
             </w:r>
           </w:p>
         </w:tc>
@@ -12787,7 +12793,7 @@
                 <w:rFonts w:ascii="Times New Roman" w:hAnsi="Times New Roman" w:cs="Times New Roman" w:eastAsia="Times New Roman"/>
                 <w:sz w:val="21"/>
               </w:rPr>
-              <w:t>Minimum điểm của các entity link bắt buộc trên path; lưu component trước cutoff để tái lập.</w:t>
+              <w:t>Minimum confidence của quyết định linking bắt buộc: entity được trích xuất lấy từ cùng complete Evidence assignment đã chọn; endpoint suy ra từ route lấy từ registry/fact đủ điều kiện tại cutoff. Không chọn Evidence khác chỉ để tăng linker score. Bảng đầu vào bốn route ở SCORING_SPEC.md.</w:t>
             </w:r>
           </w:p>
         </w:tc>
@@ -12865,7 +12871,7 @@
                 <w:rFonts w:ascii="Times New Roman" w:hAnsi="Times New Roman" w:cs="Times New Roman" w:eastAsia="Times New Roman"/>
                 <w:sz w:val="21"/>
               </w:rPr>
-              <w:t>Độ tin cậy của path hoặc phiên bản quan hệ trong [0,1]. Property dùng chung không có domain chỉ riêng Candidate.</w:t>
+              <w:t>Minimum required path-link confidence; Event–Company dùng required-role assignment score của Evidence đã chọn. Company–Stock curated registry dùng 1, automatic mapping dùng calibrated score hoặc fallback 0,5 có provenance. Không giả định các component độc lập.</w:t>
             </w:r>
           </w:p>
         </w:tc>
@@ -16881,7 +16887,7 @@
                 <w:rFonts w:ascii="Times New Roman" w:hAnsi="Times New Roman" w:cs="Times New Roman" w:eastAsia="Times New Roman"/>
                 <w:sz w:val="21"/>
               </w:rPr>
-              <w:t>Độ mạnh quan hệ, chuẩn hóa trong [0,1].</w:t>
+              <w:t>Biến thể measured khóa exposureStrength=exposureRatio sau chuẩn hóa về [0,1]. Giữ đơn vị, tử số/mẫu số và mapping hạng mục trong audit ingestion; thiếu căn cứ thì giữ staging, không đoán hoặc clipping.</w:t>
             </w:r>
           </w:p>
         </w:tc>
@@ -18152,7 +18158,7 @@
           <w:rFonts w:ascii="Times New Roman" w:hAnsi="Times New Roman" w:cs="Times New Roman" w:eastAsia="Times New Roman"/>
           <w:sz w:val="26"/>
         </w:rPr>
-        <w:t>Nếu cùng Event–Stock có nhiều đường giải thích, lưu Candidate riêng cho từng path để giữ expectedDirection, confidence và relationStrength riêng. Đây là các đường đánh giá khác nhau của cùng cặp Event–Stock; khi tổng hợp không đếm thành nhiều sự kiện độc lập. Thông tin mới sau cutoff phải tạo snapshot/candidate ở cutoff mới hoặc Event mới theo mục 2.5; không sửa ngược snapshot đã sử dụng.</w:t>
+        <w:t>Nếu cùng Event–Stock có nhiều đường giải thích, lưu Candidate riêng cho từng path để giữ expectedDirection, confidence và relationStrength riêng. Đây là các đường đánh giá khác nhau của cùng cặp Event–Stock; khi tổng hợp không đếm thành nhiều sự kiện độc lập. Thông tin mới sau cutoff không được tạo lại baseline Candidate của cùng Event tại cutoff muộn hơn. Substantive assertion mới tạo Event riêng theo mục 2.5; snapshot muộn cho cùng Event chỉ thuộc nhiệm vụ retrospective ngoài baseline và có configuration riêng. Giữ nguyên snapshot đã sử dụng.</w:t>
       </w:r>
     </w:p>
     <w:p xmlns:wp14="http://schemas.microsoft.com/office/word/2010/wordml" wp14:textId="77777777">
@@ -18312,6 +18318,9 @@
         </w:rPr>
         <w:t>inferenceCutoff lưu trên Candidate là mốc chọn thông tin đầu vào; generatedAt là thời điểm thực thi. Candidate chỉ dùng Evidence và fact khả dụng tại inferenceCutoff, đồng thời cố định confidenceScore và relationStrength theo snapshot này.</w:t>
       </w:r>
+      <w:r>
+        <w:t xml:space="preserve"> Baseline 1.0.4 khóa cutoff đúng bằng Event.availableAt, là mốc Evidence sớm nhất hỗ trợ Event, và nhỏ hơn opening day 0. Nếu tại cutoff chưa có complete assignment hay mapping đủ điều kiện, baseline không sinh Candidate; phải ghi coverage/miss, không dời cutoff hoặc loại Event khỏi gold để làm đẹp recall. Replay muộn chỉ tái lập thông tin khả dụng ở cutoff, không phải bằng chứng đã dự đoán trực tiếp lúc đó.</w:t>
+      </w:r>
     </w:p>
     <w:p xmlns:wp14="http://schemas.microsoft.com/office/word/2010/wordml" wp14:textId="77777777">
       <w:pPr>
@@ -18326,6 +18335,9 @@
         </w:rPr>
         <w:t>availableAt của Candidate không sớm hơn dữ liệu đầu vào; availableAt của Reaction không sớm hơn Candidate và toàn bộ quan sát được sử dụng. Dữ liệu sau sự kiện được dùng để đo Reaction khi đã khả dụng, nhưng không quay ngược để sinh hoặc sửa Candidate tại một cutoff trước đó.</w:t>
       </w:r>
+      <w:r>
+        <w:t xml:space="preserve"> Hai mốc tách biệt: input sinh Candidate phải có availableAt ≤ inferenceCutoff; observation tính Reaction phải có availableAt ≤ Reaction.availableAt và window đã đóng. Không giới hạn observation hậu nghiệm bằng inferenceCutoff.</w:t>
+      </w:r>
     </w:p>
     <w:p xmlns:wp14="http://schemas.microsoft.com/office/word/2010/wordml" wp14:textId="77777777">
       <w:pPr>
@@ -18376,6 +18388,9 @@
           <w:sz w:val="26"/>
         </w:rPr>
         <w:t>canonicalKey được xác lập từ loại sự kiện, chủ thể chuẩn, hành động/nội dung kinh tế, đối tượng liên quan và thời điểm hoặc kỳ nghiệp vụ theo từng loại Event. Không dùng articleId, URL hoặc tiêu đề làm khóa sự kiện. Trước khi gộp cần đối chiếu Evidence; trùng chủ thể và ngày chưa đủ kết luận là cùng Event. Khi chưa đủ căn cứ gộp, giữ riêng để rà soát, không đoán rằng hai Event là một.</w:t>
+      </w:r>
+      <w:r>
+        <w:t xml:space="preserve"> Trước khi ghép key, dùng role-value vocabulary/normalization được định phiên bản trong EVENT_DICTIONARY.yaml: action, metric, instrument, title và reporting period có token chuẩn và mapping rõ ràng. Không suy diễn synonym chưa khai báo; giá trị chưa ánh xạ được giữ staging/HOLD_FOR_REVIEW. Token extraction/identity không phải lớp hoặc property mới trong ontology.</w:t>
       </w:r>
     </w:p>
     <w:tbl>
@@ -19028,6 +19043,12 @@
         </w:rPr>
         <w:t xml:space="preserve">TTL/SHACL là nguồn chuẩn khi đối chiếu property và cardinality. Công cụ tools/audit_schema_diagram.py kiểm tra inventory trong phụ lục Draw.io, domain/range của các entry có cấu trúc, cardinality được in trực tiếp theo direct SHACL property shapes, cùng ID/reference của các tab. Property dùng chung không có domain riêng, datatype range không được in và phần diễn giải ngoài phụ lục được ghi NOT CHECKED; không được hiểu là PASS. Công cụ parse SELECT constraints nhưng không thực thi SHACL conformance, không kiểm tra calendar, snapshot, arithmetic runtime hoặc toàn bộ pipeline.</w:t>
       </w:r>
+      <w:r>
+        <w:t xml:space="preserve"> SHACL 1.0.4 còn kiểm tra impactScore=min(1,abs(CAR)/0,10), direction theo dấu CAR với epsilon=0 và cả hai chiều inverse của Event–Candidate, Candidate–Reaction. Graph đưa vào validation phải đã có đủ inverse, được writer materialize hoặc reasoner sinh trước với provenance; validator không tự sửa graph. Reaction chỉ có onCandidate vẫn bắt buộc Candidate tương ứng REACTION_READY. Calendar, dictionary membership, strength assignment, Evidence aggregation và snapshot immutability vẫn là curated gate Phase 2.</w:t>
+      </w:r>
+      <w:r>
+        <w:t xml:space="preserve"> Baseline 1.0.4 còn ràng buộc inferenceCutoff bằng Event.availableAt và kiểm tra REACTION_READY có Reaction với literal typed xsd:string nhất quán. Audit bổ sung đối chiếu vai trò mẹ/con của hasSubsidiaryRelation tại tab 00, không nâng phạm vi thành chứng minh mọi cạnh của Draw.io.</w:t>
+      </w:r>
     </w:p>
     <w:p xmlns:wp14="http://schemas.microsoft.com/office/word/2010/wordml" wp14:textId="77777777">
       <w:pPr>
@@ -19091,6 +19112,39 @@
           <w:sz w:val="26"/>
         </w:rPr>
         <w:t>Baseline được đề xuất để đánh giá: R(i,t) = adjustedClose(i,t)/adjustedClose(i,t−1) − 1; benchmark phải có adjustedClose cùng phiên và nhất quán cách điều chỉnh. AR(i,t) = R(i,t) − R(m,t); CAR(i,[a,b]) là tổng AR theo trading day. impactScore = min(1, abs(CAR)/tau), tau = 0,10. confidenceScore = 0,25 × (sourceConfidence + extractionConfidence + linkingConfidence + relationConfidence) trong baseline đều trọng số; mọi component, tau, epsilon, window và version phải được lưu để tái lập. candidateScore = confidenceScore × relationStrength; reactionWeight = impactScore × candidateScore. Phase 2 thử tau = 0,05/0,10/0,20, các event window và exposureStrength variant trên tập phát triển/validation rồi khóa trước test.</w:t>
+      </w:r>
+      <w:r>
+        <w:t xml:space="preserve"> SHACL 1.0.4 kiểm tra baseline tau=0,10 và epsilon=0; thử tau/epsilon khác phải dùng shape/configuration được định phiên bản riêng, không chỉ đổi methodVersion.</w:t>
+      </w:r>
+    </w:p>
+    <w:p>
+      <w:pPr>
+        <w:spacing w:after="100" w:line="312" w:lineRule="auto"/>
+        <w:ind w:firstLine="562"/>
+        <w:jc w:val="both"/>
+      </w:pPr>
+      <w:r>
+        <w:t>Scoring đã khóa: relationStrength DIRECT=1; ba path gián tiếp=0,5. Biến thể industry chỉ thay strength bằng exposureStrength=exposureRatio đã chuẩn hóa, không đổi population, Evidence selection hoặc strength của các path khác. Các hằng số là heuristic thực nghiệm, không phải mức ảnh hưởng kinh tế đo được.</w:t>
+      </w:r>
+    </w:p>
+    <w:p>
+      <w:pPr>
+        <w:spacing w:after="100" w:line="312" w:lineRule="auto"/>
+        <w:ind w:firstLine="562"/>
+        <w:jc w:val="both"/>
+      </w:pPr>
+      <w:r>
+        <w:t>extractionConfidence lấy maximum trên Evidence hỗ trợ cùng Event và đầy đủ required roles, phù hợp role/identity assignment đã chọn, có availableAt ≤ inferenceCutoff. Nếu chỉ có điểm per-role, lấy minimum để tạo điểm assignment cho một Evidence. Assignment có căn cứ nhưng chưa calibrated dùng fallback 0,5; thiếu role không được điền fallback. Tied score chọn Evidence URI tăng dần. Không ghép các Evidence thiếu role để tạo assignment đầy đủ trong baseline; không có Evidence hợp lệ thì không sinh curated Candidate. Audit giữ tập Evidence đủ điều kiện, URI được chọn, điểm gốc, role assignment và model/calibration version. Component ablation giữ selection gốc. Chi tiết ở SCORING_SPEC.md 1.0.4.</w:t>
+      </w:r>
+    </w:p>
+    <w:p>
+      <w:pPr>
+        <w:spacing w:after="100" w:line="312" w:lineRule="auto"/>
+        <w:ind w:firstLine="562"/>
+        <w:jc w:val="both"/>
+      </w:pPr>
+      <w:r>
+        <w:t>linkingConfidence dùng các quyết định của cùng Evidence/role assignment đã được selection theo extractionConfidence, không chọn lại Evidence theo linker score. Những entity/Stock suy ra qua route dùng versioned registry/temporal facts đủ điều kiện tại cutoff. Event–Company confidence lấy assignment score hỗ trợ role company trong Evidence được chọn; Company–Stock curated mapping dùng 1, automatic mapping dùng score calibrated hoặc fallback 0,5. SCORING_SPEC.md khóa bảng required inputs của bốn route và nơi lưu audit. Việc tái dùng score được công bố, không giả định các confidence component độc lập thống kê.</w:t>
       </w:r>
     </w:p>
     <w:tbl>
@@ -19472,6 +19526,9 @@
         </w:rPr>
         <w:t>RQ2 – Event–Stock inference: So sánh keyword/co-occurrence (ticker hoặc alias trong bài), DIRECT-only (Event → Company → Stock) và KG đầy đủ (bốn impactType) trên cùng Event, universe cổ phiếu và cutoff. Đánh giá precision/recall ở mức cặp Event–Stock, Recall@5/@10 và Precision@5/@10; báo cáo riêng cổ phiếu ngoài direct mention và từng impactType. Demo chỉ có hai Candidate DIRECT cùng cổ phiếu TCB nên chưa chứng minh lợi ích đường gián tiếp hoặc cải thiện ranking.</w:t>
       </w:r>
+      <w:r>
+        <w:t xml:space="preserve"> Stock frame và resolved universe theo Event được freeze độc lập trước predictions; method phải giới hạn generation/ranking trong universe này. Prediction ngoài universe làm run invalid, không lọc hậu nghiệm rồi tính lại top-K. Event không có Candidate vẫn được giữ để tính miss/recall theo gold.</w:t>
+      </w:r>
     </w:p>
     <w:p xmlns:wp14="http://schemas.microsoft.com/office/word/2010/wordml" wp14:textId="77777777">
       <w:pPr>
@@ -19485,6 +19542,9 @@
           <w:sz w:val="26"/>
         </w:rPr>
         <w:t xml:space="preserve">RQ3 – Weighting và ranking: Trên cùng tập Candidate của KG đầy đủ, so sánh unweighted KG và weighted KG tại inferenceCutoff bằng candidateScore. Unweighted dùng điểm 1; weighted dùng candidateScore = confidenceScore × relationStrength. Khi nhiều path cùng một Event–Stock, gom candidateScore bằng max theo rule đã khóa, không dùng CAR hoặc reactionWeight để xếp hạng tại inferenceCutoff. Reaction chỉ được phân tích hồi cứu sau khi event window đóng bằng reactionWeight. Đánh giá nDCG@5/@10 theo nhãn chuyên gia 0/1/2, Precision@K, ba ablation riêng cho extractionConfidence, linkingConfidence và relationConfidence (mỗi lần chỉ thay một component bằng 1; sourceConfidence luôn giữ 0,5) và báo cáo riêng theo impactType cùng macro theo Event. Nhãn phải độc lập với score. Ablation trung hòa biến thiên điểm của một component, không khẳng định confidence thực tế bằng 1 và không bỏ bước extraction, linking hay kiểm tra path. Mỗi variant tính lại confidenceScore/candidateScore theo công thức đã khóa, lưu Candidate URI và methodVersion riêng, giữ điểm gốc trong audit record và không ghi đè baseline. Các so sánh dùng cùng Event/Stock universe, cutoff, eligible paths, relationStrength, gold labels và tie-break; chỉ aggregate trong cùng methodVersion. Source-confidence ablation nằm ngoài baseline này.</w:t>
+      </w:r>
+      <w:r>
+        <w:t xml:space="preserve"> Per-impactType là route-level view: chiếu predictions theo route trước max aggregation/top-K, dùng gold route support được gán độc lập và common resolved universe. Pair gold hỗ trợ INDUSTRY nhưng chỉ dự đoán DIRECT là FN của INDUSTRY; overall tính relevance riêng, không đếm pair lặp. Nhãn gain của route view và negative universe được khóa ở EVALUATION_PROTOCOL.md, không lọc overall ranking theo gold sau dự đoán.</w:t>
       </w:r>
     </w:p>
     <w:p xmlns:wp14="http://schemas.microsoft.com/office/word/2010/wordml" wp14:textId="77777777">
@@ -19698,6 +19758,9 @@
         </w:rPr>
         <w:t xml:space="preserve">Các query dưới đây là competency queries dự kiến cho từng graph snapshot. DOCX nguồn ghi rằng query được chạy bằng RDFLib và có hình minh họa, nhưng gói hiện không có demo/queries, demo/results hoặc demo/test_results.json để tái chạy và đối chiếu số dòng/nguồn tạo hình. tools/audit_schema_diagram.py chỉ so sánh schema–phụ lục Draw.io, không chạy các competency queries hay dựng demo. Mọi hình/fixture trong chương này là SYNTHETIC TEST ONLY, không phải bằng chứng định lượng cho RQ1–RQ3.</w:t>
       </w:r>
+      <w:r>
+        <w:t xml:space="preserve"> Các hình được giữ nguyên làm minh họa lịch sử; nhãn “Executed RDFLib result” là nhãn của bản nguồn, không phải kết quả chạy lại bộ 1.0.4. CSV/JSON ghi trong hình không nằm trong gói này. Không dùng hình lịch sử làm bằng chứng SHACL hiện hành.</w:t>
+      </w:r>
     </w:p>
     <w:p>
       <w:pPr>
@@ -19845,6 +19908,9 @@
       </w:r>
     </w:p>
     <w:p>
+      <w:pPr>
+        <w:keepNext/>
+      </w:pPr>
       <w:r/>
       <w:r>
         <w:drawing>
@@ -19883,6 +19949,7 @@
     </w:p>
     <w:p>
       <w:pPr>
+        <w:keepLines/>
         <w:spacing w:line="312" w:lineRule="auto" w:after="120" w:before="60"/>
         <w:ind w:firstLine="0"/>
         <w:jc w:val="center"/>
@@ -19895,6 +19962,9 @@
         </w:rPr>
         <w:t>Hình Q1: SYNTHETIC TEST ONLY. Kết quả fixture không chứng minh RQ1–RQ3.</w:t>
       </w:r>
+      <w:r>
+        <w:t xml:space="preserve"> Minh họa lịch sử, chưa tái chạy trên contract 1.0.4.</w:t>
+      </w:r>
     </w:p>
     <w:p>
       <w:pPr>
@@ -20026,6 +20096,9 @@
       </w:r>
     </w:p>
     <w:p>
+      <w:pPr>
+        <w:keepNext/>
+      </w:pPr>
       <w:r/>
       <w:r>
         <w:drawing>
@@ -20064,6 +20137,7 @@
     </w:p>
     <w:p>
       <w:pPr>
+        <w:keepLines/>
         <w:spacing w:line="312" w:lineRule="auto" w:after="120" w:before="60"/>
         <w:ind w:firstLine="0"/>
         <w:jc w:val="center"/>
@@ -20076,6 +20150,9 @@
         </w:rPr>
         <w:t>Hình Q2: SYNTHETIC TEST ONLY. Kết quả fixture không chứng minh RQ1–RQ3.</w:t>
       </w:r>
+      <w:r>
+        <w:t xml:space="preserve"> Minh họa lịch sử, chưa tái chạy trên contract 1.0.4.</w:t>
+      </w:r>
     </w:p>
     <w:p>
       <w:pPr>
@@ -20207,6 +20284,9 @@
       </w:r>
     </w:p>
     <w:p>
+      <w:pPr>
+        <w:keepNext/>
+      </w:pPr>
       <w:r/>
       <w:r>
         <w:drawing>
@@ -20245,6 +20325,7 @@
     </w:p>
     <w:p>
       <w:pPr>
+        <w:keepLines/>
         <w:spacing w:line="312" w:lineRule="auto" w:after="120" w:before="60"/>
         <w:ind w:firstLine="0"/>
         <w:jc w:val="center"/>
@@ -20257,6 +20338,12 @@
         </w:rPr>
         <w:t>Hình Q3: SYNTHETIC TEST ONLY. Kết quả fixture không chứng minh RQ1–RQ3.</w:t>
       </w:r>
+      <w:r>
+        <w:t xml:space="preserve"> Minh họa lịch sử, chưa tái chạy trên contract 1.0.4.</w:t>
+      </w:r>
+      <w:r>
+        <w:t xml:space="preserve"> READY trong hình lịch sử được hiểu là nhãn hiển thị viết tắt của REACTION_READY; không phải giá trị RDF hợp lệ. Dữ liệu mới phải dùng REACTION_READY đúng enum SHACL.</w:t>
+      </w:r>
     </w:p>
     <w:p>
       <w:pPr>
@@ -20430,6 +20517,9 @@
       </w:r>
     </w:p>
     <w:p>
+      <w:pPr>
+        <w:keepNext/>
+      </w:pPr>
       <w:r/>
       <w:r>
         <w:drawing>
@@ -20468,6 +20558,7 @@
     </w:p>
     <w:p>
       <w:pPr>
+        <w:keepLines/>
         <w:spacing w:line="312" w:lineRule="auto" w:after="120" w:before="60"/>
         <w:ind w:firstLine="0"/>
         <w:jc w:val="center"/>
@@ -20480,6 +20571,9 @@
         </w:rPr>
         <w:t>Hình Q4: SYNTHETIC TEST ONLY. Kết quả fixture không chứng minh RQ1–RQ3.</w:t>
       </w:r>
+      <w:r>
+        <w:t xml:space="preserve"> Minh họa lịch sử, chưa tái chạy trên contract 1.0.4.</w:t>
+      </w:r>
     </w:p>
     <w:p>
       <w:pPr>
@@ -20675,6 +20769,9 @@
       </w:r>
     </w:p>
     <w:p>
+      <w:pPr>
+        <w:keepNext/>
+      </w:pPr>
       <w:r/>
       <w:r>
         <w:drawing>
@@ -20713,6 +20810,7 @@
     </w:p>
     <w:p>
       <w:pPr>
+        <w:keepLines/>
         <w:spacing w:line="312" w:lineRule="auto" w:after="120" w:before="60"/>
         <w:ind w:firstLine="0"/>
         <w:jc w:val="center"/>
@@ -20725,6 +20823,9 @@
         </w:rPr>
         <w:t>Hình Q5: SYNTHETIC TEST ONLY. Kết quả fixture không chứng minh RQ1–RQ3.</w:t>
       </w:r>
+      <w:r>
+        <w:t xml:space="preserve"> Minh họa lịch sử, chưa tái chạy trên contract 1.0.4.</w:t>
+      </w:r>
     </w:p>
     <w:p>
       <w:pPr>
@@ -20824,6 +20925,9 @@
       </w:r>
     </w:p>
     <w:p>
+      <w:pPr>
+        <w:keepNext/>
+      </w:pPr>
       <w:r/>
       <w:r>
         <w:drawing>
@@ -20862,6 +20966,7 @@
     </w:p>
     <w:p>
       <w:pPr>
+        <w:keepLines/>
         <w:spacing w:line="312" w:lineRule="auto" w:after="120" w:before="60"/>
         <w:ind w:firstLine="0"/>
         <w:jc w:val="center"/>
@@ -20874,6 +20979,9 @@
         </w:rPr>
         <w:t>Hình Q6: SYNTHETIC TEST ONLY. Kết quả fixture không chứng minh RQ1–RQ3.</w:t>
       </w:r>
+      <w:r>
+        <w:t xml:space="preserve"> Minh họa lịch sử, chưa tái chạy trên contract 1.0.4.</w:t>
+      </w:r>
     </w:p>
     <w:p>
       <w:pPr>
@@ -21614,6 +21722,9 @@
       </w:r>
     </w:p>
     <w:p>
+      <w:pPr>
+        <w:keepNext/>
+      </w:pPr>
       <w:r/>
       <w:r>
         <w:drawing>
@@ -21652,6 +21763,7 @@
     </w:p>
     <w:p>
       <w:pPr>
+        <w:keepLines/>
         <w:spacing w:line="312" w:lineRule="auto" w:after="120" w:before="60"/>
         <w:ind w:firstLine="0"/>
         <w:jc w:val="center"/>
@@ -21664,6 +21776,9 @@
         </w:rPr>
         <w:t>Hình Q8: SYNTHETIC TEST ONLY. Kết quả fixture không chứng minh RQ1–RQ3.</w:t>
       </w:r>
+      <w:r>
+        <w:t xml:space="preserve"> Minh họa lịch sử, chưa tái chạy trên contract 1.0.4.</w:t>
+      </w:r>
     </w:p>
     <w:p>
       <w:pPr>
@@ -21795,6 +21910,9 @@
       </w:r>
     </w:p>
     <w:p>
+      <w:pPr>
+        <w:keepNext/>
+      </w:pPr>
       <w:r/>
       <w:r>
         <w:drawing>
@@ -21833,6 +21951,7 @@
     </w:p>
     <w:p>
       <w:pPr>
+        <w:keepLines/>
         <w:spacing w:line="312" w:lineRule="auto" w:after="120" w:before="60"/>
         <w:ind w:firstLine="0"/>
         <w:jc w:val="center"/>
@@ -21845,6 +21964,9 @@
         </w:rPr>
         <w:t>Hình Q9: SYNTHETIC TEST ONLY. Kết quả fixture không chứng minh RQ1–RQ3.</w:t>
       </w:r>
+      <w:r>
+        <w:t xml:space="preserve"> Minh họa lịch sử, chưa tái chạy trên contract 1.0.4.</w:t>
+      </w:r>
     </w:p>
     <w:p>
       <w:pPr>
@@ -22024,6 +22146,9 @@
       </w:r>
     </w:p>
     <w:p>
+      <w:pPr>
+        <w:keepNext/>
+      </w:pPr>
       <w:r/>
       <w:r>
         <w:drawing>
@@ -22062,6 +22187,7 @@
     </w:p>
     <w:p>
       <w:pPr>
+        <w:keepLines/>
         <w:spacing w:line="312" w:lineRule="auto" w:after="120" w:before="60"/>
         <w:ind w:firstLine="0"/>
         <w:jc w:val="center"/>
@@ -22074,6 +22200,9 @@
         </w:rPr>
         <w:t>Hình Q10: SYNTHETIC TEST ONLY. Kết quả fixture không chứng minh RQ1–RQ3.</w:t>
       </w:r>
+      <w:r>
+        <w:t xml:space="preserve"> Minh họa lịch sử, chưa tái chạy trên contract 1.0.4.</w:t>
+      </w:r>
     </w:p>
     <w:p xmlns:wp14="http://schemas.microsoft.com/office/word/2010/wordml" wp14:textId="77777777">
       <w:pPr>
@@ -22262,7 +22391,7 @@
           <w:rFonts w:ascii="Times New Roman" w:hAnsi="Times New Roman" w:cs="Times New Roman" w:eastAsia="Times New Roman"/>
           <w:sz w:val="26"/>
         </w:rPr>
-        <w:t xml:space="preserve">Kiểm tra có thể tái chạy từ gói hiện tại là audit chỉ đọc bằng tools/audit_schema_diagram.py. Kết quả trên bộ artifact hiện tại: 336 assertion PASS, 0 FAIL và 57 NOT CHECKED; exit code 0. Công cụ parse được 38 SELECT constraints và xác nhận SHA256 của ba file đầu vào không đổi trước/sau. Các con số là số assertion có phạm vi, không phải số góp ý đã hoàn tất hoặc tỷ lệ coverage. Kết quả kiểm thử fixture/schema lịch sử không được dùng làm bằng chứng tái lập của gói này khi thiếu fixture, runner và log tương ứng. Audit không chứng minh behavioral SHACL conformance, AR/CAR trên dữ liệu thật, NLP hoặc RQ1–RQ3; layout trực quan chưa được xác minh.</w:t>
+        <w:t>Bộ contract 1.0.4 đã chạy ba kiểm tra độc lập. Audit tools/audit_schema_diagram.py: 337 assertion PASS, 0 FAIL, 57 NOT CHECKED, exit code 0; parse 44 SELECT constraints và xác nhận SHA256 ba input không đổi. Bộ tools/test_baseline_shacl.py: 31/31 test qua, bao gồm regression REACTION_READY typed string không có Reaction và cutoff khác Event.availableAt. Bộ tools/test_schema_diagram_audit.py: 8/8 test qua, bao gồm mutation sai vai trò công ty mẹ/con. Behavioral SHACL chạy inference=none. Các kiểm tra là synthetic structural regression, không tái tạo demo/hình lịch sử, không chứng minh calendar thật, NLP, immutability, metric executor hay RQ1–RQ3. Số audit là assertion có phạm vi, không phải phần trăm hoàn tất góp ý. PDF được xuất từ DOCX hiện hành bằng Microsoft Word; trạng thái kiểm tra layout được ghi trong PHASE1_ACCEPTANCE.md.</w:t>
       </w:r>
     </w:p>
     <w:p xmlns:wp14="http://schemas.microsoft.com/office/word/2010/wordml" wp14:textId="77777777">
@@ -22276,7 +22405,7 @@
           <w:rFonts w:ascii="Times New Roman" w:hAnsi="Times New Roman" w:cs="Times New Roman" w:eastAsia="Times New Roman"/>
           <w:sz w:val="26"/>
         </w:rPr>
-        <w:t>Phạm vi kiểm chứng gồm snapshot trước/sau window, daily effective date, Candidate/Reaction, provenance Stock/benchmark, arithmetic, duplicate và temporal/reporting-period selection. Cả hai Candidate demo đều DIRECT trên TCB: không đủ kết luận lợi ích các path gián tiếp hoặc chất lượng ranking. Các quan hệ updates/contradicts/supersedes vẫn là đặc tả, không gán thêm cho case khi chưa có bằng chứng.</w:t>
+        <w:t>Phạm vi còn cần kiểm chứng trong Phase 2 gồm snapshot trước/sau window, daily effective date theo calendar thật, frozen cutoff/Evidence selection, strength assignment, duplicate và temporal/reporting-period selection trên nguồn thật. Các test SHACL tổng hợp vừa nêu chỉ kiểm chứng các ràng buộc cấu trúc tương ứng, không thay thế pipeline. Cả hai Candidate demo lịch sử đều DIRECT trên TCB: không đủ kết luận lợi ích các path gián tiếp hoặc chất lượng ranking. Các quan hệ updates/contradicts/supersedes vẫn là đặc tả, không gán thêm cho case khi chưa có bằng chứng.</w:t>
       </w:r>
     </w:p>
     <w:p xmlns:wp14="http://schemas.microsoft.com/office/word/2010/wordml" wp14:textId="77777777">
@@ -22299,6 +22428,12 @@
           <w:sz w:val="26"/>
         </w:rPr>
         <w:t xml:space="preserve">Từ folder chứa TTL/SHACL/Draw.io, chạy python tools/audit_schema_diagram.py; thêm --verbose để xem chi tiết PASS hoặc --json để in JSON ra stdout. Dependency và giới hạn kiểm tra nằm trong tools/README.md. Script trả 0 nếu không phát hiện FAIL trong phạm vi hỗ trợ (vẫn có thể có NOT CHECKED), 1 nếu có khác biệt và 2 nếu không hoàn tất do lỗi input/định dạng/parser. Script không ghi lại artifact hoặc tự tạo file kết quả. Các demo query vẫn cần graph snapshot và runner riêng: Query 5 dành cho snapshot pending, query còn lại dùng snapshot được chỉ định. Gói này không phải pipeline demo/evaluation hoàn chỉnh; calendar thị trường thật, NLP, multi-window và thực nghiệm RQ thuộc Phase 2.</w:t>
+      </w:r>
+      <w:r>
+        <w:t xml:space="preserve"> Để chạy behavioral regression với interpreter đã kiểm tra: py -3.13 -B tools/test_baseline_shacl.py; audit: py -3.13 -B tools/audit_schema_diagram.py. Dependency rdflib/pyshacl và phạm vi test nằm trong tools/README.md.</w:t>
+      </w:r>
+      <w:r>
+        <w:t xml:space="preserve"> Regression audit vai trò có trong gói: py -3.13 -B tools/test_schema_diagram_audit.py. PHASE1_ACCEPTANCE.md đối chiếu từng yêu cầu thầy, lệnh tái chạy, kết quả hiện hành và phần việc Phase 2 còn lại.</w:t>
       </w:r>
     </w:p>
     <w:p>
@@ -22450,7 +22585,7 @@
                 <w:rFonts w:ascii="Times New Roman" w:hAnsi="Times New Roman" w:cs="Times New Roman" w:eastAsia="Times New Roman"/>
                 <w:sz w:val="21"/>
               </w:rPr>
-              <w:t>Draw.io tab 05-4 đã ghi relationPath = impactType theo baseline 1.0.2. Audit chỉ đọc đối chiếu phụ lục với TTL/SHACL; không thay thế review các tab diễn giải hoặc kiểm tra layout.</w:t>
+              <w:t>Namespace và bốn routes đã đồng bộ. Tab 00 sửa owner relation thành mẹ; tab 03 tách ticker string/Stock URI và linking/RDF; tab 02 tách datatype availableAt khỏi cạnh entity, bổ sung GovernmentOrganization. Audit vẫn chỉ bảo đảm các assertion được công bố.</w:t>
             </w:r>
           </w:p>
         </w:tc>
@@ -22568,7 +22703,7 @@
                 <w:rFonts w:ascii="Times New Roman" w:hAnsi="Times New Roman" w:cs="Times New Roman" w:eastAsia="Times New Roman"/>
                 <w:sz w:val="21"/>
               </w:rPr>
-              <w:t xml:space="preserve">Đặc tả 1.0.2 có confidence components và freeze rule. Audit đối chiếu các property có cấu trúc trong appendix; không kiểm chứng calibration, snapshot immutability hoặc behavior của constraint confidence trên fixture.</w:t>
+              <w:t>Đã khóa component/freeze, complete-Evidence selection và đầu vào linking/relation confidence cho bốn route. Behavioral test phát hiện thiếu linkingConfidence, sai confidenceScore/candidateScore. Calibration và selection trên dữ liệu thật thuộc Phase 2.</w:t>
             </w:r>
           </w:p>
         </w:tc>
@@ -22627,7 +22762,7 @@
                 <w:rFonts w:ascii="Times New Roman" w:hAnsi="Times New Roman" w:cs="Times New Roman" w:eastAsia="Times New Roman"/>
                 <w:sz w:val="21"/>
               </w:rPr>
-              <w:t xml:space="preserve">Đặc tả tách inference score và post-window score. Audit kiểm tra property inventory/ownership có khai báo; không thực thi phép tính score hoặc kiểm thử chống leakage của ranker.</w:t>
+              <w:t>Đã tách score và khóa strength bốn path. SHACL regression kiểm tra score, impactScore, direction và weight trên fixture tổng hợp; không chứng minh chống leakage của ranker hoặc scoring trên dữ liệu thật.</w:t>
             </w:r>
           </w:p>
         </w:tc>
@@ -22686,7 +22821,7 @@
                 <w:rFonts w:ascii="Times New Roman" w:hAnsi="Times New Roman" w:cs="Times New Roman" w:eastAsia="Times New Roman"/>
                 <w:sz w:val="21"/>
               </w:rPr>
-              <w:t xml:space="preserve">Đặc tả có stock/index observations và provenance. Audit đối chiếu các endpoint/cardinality được biểu diễn trong appendix; sourceReference chỉ được name coverage nếu không có entry có cấu trúc. Chưa chạy behavioral tests về coverage hoặc return/AR/CAR trên dữ liệu thật.</w:t>
+              <w:t>Đặc tả có stock/index provenance. Behavioral test phát hiện thiếu adjustedClose benchmark và sai return/CAR trên fixture tổng hợp; chưa kiểm chứng calendar coverage hoặc AR/CAR trên dữ liệu thật. Giới hạn audit sourceReference không thay đổi.</w:t>
             </w:r>
           </w:p>
         </w:tc>
@@ -22745,7 +22880,7 @@
                 <w:rFonts w:ascii="Times New Roman" w:hAnsi="Times New Roman" w:cs="Times New Roman" w:eastAsia="Times New Roman"/>
                 <w:sz w:val="21"/>
               </w:rPr>
-              <w:t xml:space="preserve">EVENT_DICTIONARY.yaml là nguồn dictionary trong gói. Audit schema–diagram không kiểm tra chất lượng annotation, extraction hoặc event identity; không dùng kết quả synthetic lịch sử làm bằng chứng đánh giá NLP.</w:t>
+              <w:t>Dictionary 1.0.4 có 14 eventType cùng vocabulary/normalization cho role tham gia key và chính sách HOLD khi chưa chuẩn hóa. Chất lượng annotation, extraction và identity resolution phải đánh giá ở Phase 2.</w:t>
             </w:r>
           </w:p>
         </w:tc>
@@ -22863,7 +22998,7 @@
                 <w:rFonts w:ascii="Times New Roman" w:hAnsi="Times New Roman" w:cs="Times New Roman" w:eastAsia="Times New Roman"/>
                 <w:sz w:val="21"/>
               </w:rPr>
-              <w:t xml:space="preserve">Protocol nằm trong EVALUATION_PROTOCOL.md và ANNOTATION_GUIDELINE.md. Ba component ablations giữ sourceConfidence = 0,5. Audit không thực thi dataset split, metric, bootstrap hoặc đánh giá RQ; các bước đó thuộc Phase 2.</w:t>
+              <w:t>Protocol khóa stock frame/universe, out-of-universe invalidation, cutoff trước day 0, route-level projection trước top-K và macro Event. 25% double-label, paired bootstrap và ba component ablations giữ sourceConfidence=0,5. Chưa chạy dữ liệu/metric executor Phase 2.</w:t>
             </w:r>
           </w:p>
         </w:tc>
@@ -22922,7 +23057,7 @@
                 <w:rFonts w:ascii="Times New Roman" w:hAnsi="Times New Roman" w:cs="Times New Roman" w:eastAsia="Times New Roman"/>
                 <w:sz w:val="21"/>
               </w:rPr>
-              <w:t>Draw.io đã được sửa các route và relationPath đã xác định. Gói có tools/audit_schema_diagram.py và README; audit phụ lục không phát hiện khác biệt trong phạm vi hỗ trợ. Các mục NOT CHECKED và visual verification được báo riêng.</w:t>
+              <w:t>Đã sửa cả tab 00 và tab 03; bổ sung audit/test kiểm tra relation owner đúng parentCompany. Appendix có các property thầy nêu. Sơ đồ vẫn minh họa, không thay thế TTL/SHACL; NOT CHECKED và giới hạn layout được công bố.</w:t>
             </w:r>
           </w:p>
         </w:tc>
@@ -23012,7 +23147,7 @@
           <w:rFonts w:ascii="Times New Roman" w:hAnsi="Times New Roman" w:cs="Times New Roman" w:eastAsia="Times New Roman"/>
           <w:sz w:val="26"/>
         </w:rPr>
-        <w:t>Các đường suy luận ngoài bốn baseline phải được đánh dấu rõ: FUTURE EXTENSION — NOT IMPLEMENTED IN PHASE 2 BASELINE. Trong baseline 1.0.2, relationPath phải bằng impactType. Draw.io được đối chiếu theo contract TTL/SHACL và chỉ minh họa bốn baseline path; TTL/SHACL vẫn là source of truth.</w:t>
+        <w:t>Các đường suy luận ngoài bốn baseline phải được đánh dấu rõ: FUTURE EXTENSION — NOT IMPLEMENTED IN PHASE 2 BASELINE. Trong baseline 1.0.4, relationPath phải bằng impactType. Draw.io được đối chiếu theo contract TTL/SHACL và chỉ minh họa bốn baseline path; TTL/SHACL vẫn là source of truth.</w:t>
       </w:r>
     </w:p>
     <w:p>

</xml_diff>

<commit_message>
docs: finalize Phase 1 review and add Phase 2 plan
</commit_message>
<xml_diff>
--- a/chỉnh sửa mới nhất - 01-10/Bao_cao_Phase_1_Ontology_WFKG_ban_chot_da_dong_bo_hieu_dinh.docx
+++ b/chỉnh sửa mới nhất - 01-10/Bao_cao_Phase_1_Ontology_WFKG_ban_chot_da_dong_bo_hieu_dinh.docx
@@ -200,7 +200,7 @@
           <w:rFonts w:ascii="Times New Roman" w:hAnsi="Times New Roman" w:cs="Times New Roman" w:eastAsia="Times New Roman"/>
           <w:sz w:val="26"/>
         </w:rPr>
-        <w:t>RQ2 – Event–Stock inference: Các relation path trong KG có giúp phát hiện các cổ phiếu liên quan ngoài direct mention tốt hơn baseline keyword/co-occurrence hay không?</w:t>
+        <w:t>RQ2 – Event–Stock inference: Các relation path trong KG có giúp phát hiện các cổ phiếu liên quan ngoài direct mention tốt hơn baseline keyword/co-occurrence hay không? Ba method dùng chung extractor/registry. Keyword quét toàn văn Article hỗ trợ Event đã available tại cutoff, match alias/ticker chính xác theo registry và union Stock, score=1; prediction bucket DIRECT chỉ là quy ước, indirect abstain. DIRECT-only và KG bốn đường dùng score=1 cho RQ2; RQ3 mới so với candidateScore trên cùng paths. Matching/route projection khóa chi tiết trong EVALUATION_PROTOCOL.md. Cả ba method, kể cả keyword, dùng cùng complete-assignment gate tại cutoff: thiếu assignment thì đều trả empty ranking, gold Event vẫn giữ trong universe.</w:t>
       </w:r>
     </w:p>
     <w:p xmlns:wp14="http://schemas.microsoft.com/office/word/2010/wordml" wp14:textId="77777777">
@@ -214,11 +214,9 @@
           <w:rFonts w:ascii="Times New Roman" w:hAnsi="Times New Roman" w:cs="Times New Roman" w:eastAsia="Times New Roman"/>
           <w:sz w:val="26"/>
         </w:rPr>
-        <w:t xml:space="preserve">RQ3 – Weighting và ranking: Trên cùng tập Candidate của KG đầy đủ, so sánh unweighted KG và weighted KG tại inferenceCutoff bằng candidateScore; market reaction chỉ được phân tích hồi cứu sau khi window đóng bằng reactionWeight. Khi nhiều path cùng một Event–Stock, gom candidateScore/reactionWeight bằng max theo quy tắc đã khóa, không cộng lặp CAR. Đánh giá nDCG@5/@10 theo nhãn chuyên gia 0/1/2, Precision@K và ba ablation riêng cho extractionConfidence, linkingConfidence và relationConfidence (mỗi lần chỉ thay một component bằng 1; sourceConfidence luôn giữ 0,5). Nhãn phải độc lập với công thức score để tránh đánh giá vòng tròn.</w:t>
-      </w:r>
-      <w:r>
-        <w:t xml:space="preserve"> Per-impactType phải chiếu predictions theo route trước aggregation/top-K, không lọc bằng gold sau dự đoán; common universe và nhãn độc lập được khóa trong EVALUATION_PROTOCOL.md.</w:t>
-      </w:r>
+        <w:t>RQ3 – Weighting và ranking: Trên cùng tập Candidate của KG đầy đủ, so sánh unweighted KG và weighted KG tại inferenceCutoff bằng candidateScore; market reaction chỉ được phân tích hồi cứu sau khi window đóng bằng reactionWeight. Khi nhiều path cùng một Event–Stock, gom candidateScore bằng max trong cùng methodVersion/cutoff; reactionWeight báo riêng theo path, không cộng lặp CAR. Đánh giá nDCG@5/@10 theo nhãn chuyên gia 0/1/2, Precision@K và ba ablation riêng cho extractionConfidence, linkingConfidence và relationConfidence (mỗi lần chỉ thay một component bằng 1; sourceConfidence luôn giữ 0,5). Nhãn phải độc lập với công thức score để tránh đánh giá vòng tròn. Per-impactType phải chiếu predictions theo route trước aggregation/top-K, không lọc bằng gold sau dự đoán; common universe và nhãn độc lập được khóa trong EVALUATION_PROTOCOL.md.</w:t>
+      </w:r>
+      <w:r/>
     </w:p>
     <w:p xmlns:wp14="http://schemas.microsoft.com/office/word/2010/wordml" wp14:textId="77777777">
       <w:pPr>
@@ -18288,7 +18286,7 @@
           <w:rFonts w:ascii="Times New Roman" w:hAnsi="Times New Roman" w:cs="Times New Roman" w:eastAsia="Times New Roman"/>
           <w:sz w:val="26"/>
         </w:rPr>
-        <w:t>Khi nguồn bổ sung hoặc sửa một quan hệ, lưu node phiên bản mới với IRI, availableAt và sourceReference riêng, không ghi đè phiên bản lịch sử. Với ba quan hệ theo nhiệm kỳ/hiệu lực, chọn latest availableAt trước rồi mới xét validFrom/validTo; tie-break IRI tăng dần. IndustryExposure áp dụng selection contract riêng theo Bank–Industry–periodType, reporting period và staleness.</w:t>
+        <w:t>Khi nguồn bổ sung hoặc sửa một quan hệ, lưu node phiên bản mới với IRI, availableAt và sourceReference riêng, không ghi đè phiên bản lịch sử. Với ba quan hệ theo nhiệm kỳ/hiệu lực, chọn latest availableAt trước rồi mới xét validFrom/validTo; tie-break IRI tăng dần. IndustryExposure áp dụng selection contract riêng theo Bank–Industry–periodType, reporting scope, reporting period và staleness.</w:t>
       </w:r>
     </w:p>
     <w:p xmlns:wp14="http://schemas.microsoft.com/office/word/2010/wordml" wp14:textId="77777777">
@@ -19510,7 +19508,7 @@
           <w:rFonts w:ascii="Times New Roman" w:hAnsi="Times New Roman" w:cs="Times New Roman" w:eastAsia="Times New Roman"/>
           <w:sz w:val="26"/>
         </w:rPr>
-        <w:t>RQ1 – Extraction và entity linking: Có thể xây dựng provenance-aware financial KG từ tin tức tiếng Việt với độ chính xác như thế nào? Phase 2 đánh giá Evidence span, event type/required roles, entity linking và duplicate pairwise P/R/F1. Quan hệ Event được kiểm tra ở hai tầng: assertion trực tiếp trên cặp có thứ tự với gold cùng quy ước lưu; OWL-RL trên ontology/snapshot đã đóng băng và chất lượng graph cuối với semantic gold độc lập. Contradicts cuối dùng khóa cặp URI đã sắp xếp, deduplicate hai chiều; các relation còn lại chấm có hướng. Báo metrics/support riêng, không trộn mẫu ordered và unordered. NONE phụ thuộc view; không gán reverse contradiction là semantic-negative, không coi thiếu triple là gold-negative. Gold/universe/negatives phải adjudicate trước prediction; manifest ghi reasoner/version, cutoff, provenance và pair owner bootstrap. OWL có thể suy đúng quy tắc từ assertion sai nên vẫn phải chấm graph cuối; demo synthetic không chứng minh chất lượng RQ.</w:t>
+        <w:t>RQ1 – Extraction và entity linking: Có thể xây dựng provenance-aware financial KG từ tin tức tiếng Việt với độ chính xác như thế nào? Phase 2 đánh giá Evidence span, event type/required roles, entity linking và duplicate pairwise P/R/F1. Quan hệ Event được kiểm tra ở hai tầng: assertion trực tiếp trên cặp có thứ tự với gold cùng quy ước lưu; OWL-RL trên ontology/snapshot đã đóng băng và chất lượng graph cuối với semantic gold độc lập. Contradicts cuối dùng khóa cặp URI đã sắp xếp, deduplicate hai chiều; các relation còn lại chấm có hướng. Báo metrics/support riêng, không trộn mẫu ordered và unordered. NONE phụ thuộc view; không gán reverse contradiction là semantic-negative, không coi thiếu triple là gold-negative. Gold/universe/negatives phải adjudicate trước prediction; manifest ghi reasoner/version, cutoff, provenance và pair owner bootstrap. OWL có thể suy đúng quy tắc từ assertion sai nên vẫn phải chấm graph cuối; demo synthetic không chứng minh chất lượng RQ. Matching primary là exact one-to-one trên articleId, offsets Unicode [start,end) và eventType; output trùng dư là FP, gold không match là FN. Role/entity URI được chấm end-to-end trên mention đã match; oracle-mention linking là diagnostic riêng. Quy tắc cluster alignment và coverage ledger nằm trong EVALUATION_PROTOCOL.md, không đưa gold ID vào extractor.</w:t>
       </w:r>
     </w:p>
     <w:p xmlns:wp14="http://schemas.microsoft.com/office/word/2010/wordml" wp14:textId="77777777">
@@ -19524,11 +19522,9 @@
           <w:rFonts w:ascii="Times New Roman" w:hAnsi="Times New Roman" w:cs="Times New Roman" w:eastAsia="Times New Roman"/>
           <w:sz w:val="26"/>
         </w:rPr>
-        <w:t>RQ2 – Event–Stock inference: So sánh keyword/co-occurrence (ticker hoặc alias trong bài), DIRECT-only (Event → Company → Stock) và KG đầy đủ (bốn impactType) trên cùng Event, universe cổ phiếu và cutoff. Đánh giá precision/recall ở mức cặp Event–Stock, Recall@5/@10 và Precision@5/@10; báo cáo riêng cổ phiếu ngoài direct mention và từng impactType. Demo chỉ có hai Candidate DIRECT cùng cổ phiếu TCB nên chưa chứng minh lợi ích đường gián tiếp hoặc cải thiện ranking.</w:t>
-      </w:r>
-      <w:r>
-        <w:t xml:space="preserve"> Stock frame và resolved universe theo Event được freeze độc lập trước predictions; method phải giới hạn generation/ranking trong universe này. Prediction ngoài universe làm run invalid, không lọc hậu nghiệm rồi tính lại top-K. Event không có Candidate vẫn được giữ để tính miss/recall theo gold.</w:t>
-      </w:r>
+        <w:t>RQ2 – Event–Stock inference: So sánh keyword/co-occurrence (ticker hoặc alias trong bài), DIRECT-only (Event → Company → Stock) và KG đầy đủ (bốn impactType) trên cùng Event, universe cổ phiếu và cutoff. Đánh giá precision/recall ở mức cặp Event–Stock, Recall@5/@10 và Precision@5/@10; báo cáo riêng cổ phiếu ngoài direct mention và từng impactType. Demo chỉ có hai Candidate DIRECT cùng cổ phiếu TCB nên chưa chứng minh lợi ích đường gián tiếp hoặc cải thiện ranking. Stock frame và resolved universe theo Event được freeze độc lập trước predictions; method phải giới hạn generation/ranking trong universe này. Prediction ngoài universe làm run invalid, không lọc hậu nghiệm rồi tính lại top-K. Event không có Candidate vẫn được giữ để tính miss/recall theo gold. Ba method dùng chung extractor/registry. Keyword quét toàn văn Article hỗ trợ Event đã available tại cutoff, match alias/ticker chính xác theo registry và union Stock, score=1; prediction bucket DIRECT chỉ là quy ước, indirect abstain. DIRECT-only và KG bốn đường dùng score=1 cho RQ2; RQ3 mới so với candidateScore trên cùng paths. Matching/route projection khóa chi tiết trong EVALUATION_PROTOCOL.md. Cả ba method, kể cả keyword, dùng cùng complete-assignment gate tại cutoff: thiếu assignment thì đều trả empty ranking, gold Event vẫn giữ trong universe.</w:t>
+      </w:r>
+      <w:r/>
     </w:p>
     <w:p xmlns:wp14="http://schemas.microsoft.com/office/word/2010/wordml" wp14:textId="77777777">
       <w:pPr>
@@ -21002,7 +20998,7 @@
           <w:rFonts w:ascii="Times New Roman" w:hAnsi="Times New Roman" w:cs="Times New Roman" w:eastAsia="Times New Roman"/>
           <w:sz w:val="26"/>
         </w:rPr>
-        <w:t>Mục đích: ba relation theo validity chọn phiên bản mới nhất trước khi xét hiệu lực; IndustryExposure dùng baseline periodType=YEAR, chọn theo reporting period/version và staleness tối đa 365 ngày, không bắt buộc validFrom.</w:t>
+        <w:t>Mục đích: ba relation theo validity chọn phiên bản mới nhất trước khi xét hiệu lực; IndustryExposure dùng baseline periodType=YEAR, chọn theo reporting period/version và staleness tối đa 365 ngày, không bắt buộc validFrom. Graph phải được prefilter đúng reporting scope đã khóa; consolidated và standalone không cạnh tranh trong cùng phép chọn. Sửa identity nghiệp vụ phải dùng version registry, không để hai key cũ/mới cùng hoạt động. Giới hạn: truy vấn dưới đây chỉ minh họa khi endpoint, validFrom và positionTitle của business key không đổi giữa các phiên bản; không xử lý identity correction. Khi các trường này được sửa, phải ánh xạ version registry và chọn latest theo business key ổn định trong EVENT_SCHEMA.md trước inference; không dùng kết quả query này làm executor tổng quát.</w:t>
       </w:r>
     </w:p>
     <w:p>
@@ -23188,7 +23184,7 @@
           <w:rFonts w:ascii="Times New Roman" w:hAnsi="Times New Roman" w:cs="Times New Roman" w:eastAsia="Times New Roman"/>
           <w:sz w:val="26"/>
         </w:rPr>
-        <w:t>Tại cutoff t, trong cùng Bank–Industry và periodType đã khóa theo methodVersion, chỉ xét IndustryExposure có availableAt ≤ t và periodEnd ≤ date(t). Chọn periodEnd lớn nhất, sau đó availableAt lớn nhất, rồi IRI tăng dần; áp dụng staleness tối đa 365 ngày. Nếu không đạt thì không sinh INDIRECT_INDUSTRY. validFrom/validTo chỉ có ý nghĩa khi nguồn thực sự cung cấp; không tự tạo ngày hiệu lực từ kỳ báo cáo. Quy tắc chi tiết nằm trong EVENT_SCHEMA.md.</w:t>
+        <w:t>Tại cutoff t, trong cùng Bank–Industry, reporting scope (consolidated hoặc standalone) và periodType đã khóa theo methodVersion, chỉ xét IndustryExposure có availableAt ≤ t và periodEnd ≤ date(t). Chọn periodEnd lớn nhất, sau đó availableAt lớn nhất, rồi IRI tăng dần; áp dụng staleness tối đa 365 ngày. Nếu không đạt thì không sinh INDIRECT_INDUSTRY. validFrom/validTo chỉ có ý nghĩa khi nguồn thực sự cung cấp; không tự tạo ngày hiệu lực từ kỳ báo cáo. Quy tắc chi tiết nằm trong EVENT_SCHEMA.md.</w:t>
       </w:r>
     </w:p>
     <w:p>

</xml_diff>

<commit_message>
Finalize Phase 1 WFKG contract and HDBank fixture
</commit_message>
<xml_diff>
--- a/chỉnh sửa mới nhất - 01-10/Bao_cao_Phase_1_Ontology_WFKG_ban_chot_da_dong_bo_hieu_dinh.docx
+++ b/chỉnh sửa mới nhất - 01-10/Bao_cao_Phase_1_Ontology_WFKG_ban_chot_da_dong_bo_hieu_dinh.docx
@@ -311,10 +311,10 @@
           <w:rFonts w:ascii="Times New Roman" w:hAnsi="Times New Roman" w:cs="Times New Roman" w:eastAsia="Times New Roman"/>
           <w:sz w:val="26"/>
         </w:rPr>
-        <w:t xml:space="preserve">Ontology gồm 22 lớp: 18 lớp nghiệp vụ và 4 lớp biểu diễn quan hệ theo thời gian. Bank là lớp con của Company. Tên thống nhất là WFKG; namespace wfkg: &lt;https://example.org/wfkg/v1#&gt;. Trong gói này, ontology_v1.0.ttl và shapes_v1.0.ttl là nguồn chuẩn về schema; bảng trong báo cáo được rà theo các contract đó. Gói có tools/audit_schema_diagram.py và tools/README.md để kiểm tra chỉ đọc sự nhất quán của phụ lục Draw.io với TTL/SHACL. Công cụ không tự sửa hoặc dựng lại bảng, báo cáo hay sơ đồ.</w:t>
-      </w:r>
-      <w:r>
-        <w:t xml:space="preserve"> Phiên bản contract hiện hành là 1.0.4; giữ nguyên tên ontology_v1.0.ttl và shapes_v1.0.ttl, namespace và 22 lớp. Phiên bản tăng để không gán quy tắc mới cho kết quả snapshot cũ.</w:t>
+        <w:t xml:space="preserve">Ontology gồm 22 lớp: 18 lớp nghiệp vụ và 4 lớp biểu diễn quan hệ theo thời gian. Bank là lớp con của Company. Tên thống nhất là WFKG; namespace wfkg: &lt;https://example.org/wfkg/v1#&gt;. Trong gói này, ontology_v1.0.ttl và shapes_v1.0.ttl là nguồn chuẩn về schema; bảng trong báo cáo được rà theo các contract đó. Gói có tools/audit_schema_diagram.py và tools/README.md để kiểm tra chỉ đọc sự nhất quán của phụ lục Draw.io với TTL/SHACL. Công cụ không tự sửa hoặc dựng lại bảng, báo cáo hay sơ đồ. Phiên bản contract hiệu đính là 1.0.5; giữ nguyên tên ontology_v1.0.ttl và shapes_v1.0.ttl, namespace và 22 lớp. Phiên bản tăng để không gán quy tắc mới cho kết quả snapshot cũ.</w:t>
+      </w:r>
+      <w:r>
+        <w:t xml:space="preserve"/>
       </w:r>
     </w:p>
     <w:tbl>
@@ -1332,7 +1332,7 @@
           <w:rFonts w:ascii="Times New Roman" w:hAnsi="Times New Roman" w:cs="Times New Roman" w:eastAsia="Times New Roman"/>
           <w:sz w:val="26"/>
         </w:rPr>
-        <w:t>Các tình huống ngành, chính sách và doanh nghiệp đều phải đi qua quy tắc liên kết được định phiên bản; không tự coi các doanh nghiệp cùng ngành là có exposure bằng nhau. Các mở rộng đường liên hệ được đánh giá ở Phase 2. Trong baseline 1.0.4, relationPath là mã route ổn định và phải bằng impactType; các mũi tên trong bảng chỉ mô tả topology. Không lưu chuỗi URI/property/phiên bản quan hệ vào relationPath; candidateReason giải thích việc chọn Candidate, còn các quan hệ và provenance được biểu diễn bằng liên kết RDF và relation node tương ứng.</w:t>
+        <w:t>Các tình huống ngành, chính sách và doanh nghiệp đều phải đi qua quy tắc liên kết được định phiên bản; không tự coi các doanh nghiệp cùng ngành là có exposure bằng nhau. Các đường ngoài bốn baseline là FUTURE EXTENSION — NOT IMPLEMENTED IN PHASE 2 BASELINE. Trong baseline 1.0.5, relationPath là mã route ổn định và phải bằng impactType; các mũi tên trong bảng chỉ mô tả topology. Không lưu chuỗi URI/property/phiên bản quan hệ vào relationPath; candidateReason giải thích việc chọn Candidate, còn các quan hệ và provenance được biểu diễn bằng liên kết RDF và relation node tương ứng.</w:t>
       </w:r>
     </w:p>
     <w:p xmlns:wp14="http://schemas.microsoft.com/office/word/2010/wordml" wp14:textId="77777777">
@@ -12089,7 +12089,7 @@
                 <w:rFonts w:ascii="Times New Roman" w:hAnsi="Times New Roman" w:cs="Times New Roman" w:eastAsia="Times New Roman"/>
                 <w:sz w:val="21"/>
               </w:rPr>
-              <w:t>Baseline 1.0.4 khóa inferenceCutoff = Event.availableAt, trước opening day 0. Chỉ dùng Evidence, dữ liệu và phiên bản quan hệ đã khả dụng tại mốc này. generatedAt có thể muộn hơn khi replay, nhưng không được lấy thêm thông tin sau cutoff.</w:t>
+              <w:t>Baseline 1.0.5 khóa inferenceCutoff = Event.availableAt, trước opening day 0. Chỉ dùng Evidence, dữ liệu và phiên bản quan hệ đã khả dụng tại mốc này. generatedAt có thể muộn hơn khi replay, nhưng không được lấy thêm thông tin sau cutoff.</w:t>
             </w:r>
           </w:p>
         </w:tc>
@@ -18142,7 +18142,7 @@
           <w:rFonts w:ascii="Times New Roman" w:hAnsi="Times New Roman" w:cs="Times New Roman" w:eastAsia="Times New Roman"/>
           <w:sz w:val="26"/>
         </w:rPr>
-        <w:t>Một Candidate thuộc một Event, một Stock và một relationPath chuẩn hóa tại một inferenceCutoff, theo một methodVersion sinh ứng viên. Khóa chống trùng là (canonicalKey của Event, stockId, relationPath, inferenceCutoff, methodVersion). candidateId là định danh ổn định của bản ghi này. Thêm bài báo trùng hoặc chạy lại cùng đầu vào không sinh Candidate mới.</w:t>
+        <w:t>Một Candidate biểu diễn một đường cụ thể đủ điều kiện. Khóa chống trùng là (Event URI chuẩn ổn định, Stock URI chuẩn, relationPath, concretePathKey, inferenceCutoff, methodVersion). relationPath vẫn là mã route bằng impactType; concretePathKey là hash của định danh đường trong audit ngoài RDF, theo EVENT_SCHEMA.md. Khác entry entity, relation-version hoặc mapping record thì khác đường và khác Candidate; trùng đường thì không sinh thêm Candidate. canonicalKey tại cutoff chỉ là giá trị audit: bổ sung key giữ nguyên Event URI và Candidate ID. Freeze đường, Evidence và điểm; không chọn lại đầu vào khi replay. Ranking vẫn max theo Event–Stock; không cộng CAR lặp.</w:t>
       </w:r>
     </w:p>
     <w:p xmlns:wp14="http://schemas.microsoft.com/office/word/2010/wordml" wp14:textId="77777777">
@@ -18314,10 +18314,10 @@
           <w:rFonts w:ascii="Times New Roman" w:hAnsi="Times New Roman" w:cs="Times New Roman" w:eastAsia="Times New Roman"/>
           <w:sz w:val="26"/>
         </w:rPr>
-        <w:t>inferenceCutoff lưu trên Candidate là mốc chọn thông tin đầu vào; generatedAt là thời điểm thực thi. Candidate chỉ dùng Evidence và fact khả dụng tại inferenceCutoff, đồng thời cố định confidenceScore và relationStrength theo snapshot này.</w:t>
-      </w:r>
-      <w:r>
-        <w:t xml:space="preserve"> Baseline 1.0.4 khóa cutoff đúng bằng Event.availableAt, là mốc Evidence sớm nhất hỗ trợ Event, và nhỏ hơn opening day 0. Nếu tại cutoff chưa có complete assignment hay mapping đủ điều kiện, baseline không sinh Candidate; phải ghi coverage/miss, không dời cutoff hoặc loại Event khỏi gold để làm đẹp recall. Replay muộn chỉ tái lập thông tin khả dụng ở cutoff, không phải bằng chứng đã dự đoán trực tiếp lúc đó.</w:t>
+        <w:t>inferenceCutoff lưu trên Candidate là mốc chọn thông tin đầu vào; generatedAt là thời điểm thực thi. Candidate chỉ dùng Evidence và fact khả dụng tại inferenceCutoff, đồng thời cố định confidenceScore và relationStrength theo snapshot này. Baseline 1.0.5 khóa cutoff đúng bằng Event.availableAt, là mốc Evidence sớm nhất hỗ trợ Event, và nhỏ hơn opening day 0. Nếu tại cutoff chưa có complete assignment hay mapping đủ điều kiện, baseline không sinh Candidate; phải ghi coverage/miss, không dời cutoff hoặc loại Event khỏi gold để làm đẹp recall. Replay muộn chỉ tái lập thông tin khả dụng ở cutoff, không phải bằng chứng đã dự đoán trực tiếp lúc đó.</w:t>
+      </w:r>
+      <w:r>
+        <w:t xml:space="preserve"/>
       </w:r>
     </w:p>
     <w:p xmlns:wp14="http://schemas.microsoft.com/office/word/2010/wordml" wp14:textId="77777777">
@@ -19039,13 +19039,13 @@
           <w:rFonts w:ascii="Times New Roman" w:hAnsi="Times New Roman" w:cs="Times New Roman" w:eastAsia="Times New Roman"/>
           <w:sz w:val="26"/>
         </w:rPr>
-        <w:t xml:space="preserve">TTL/SHACL là nguồn chuẩn khi đối chiếu property và cardinality. Công cụ tools/audit_schema_diagram.py kiểm tra inventory trong phụ lục Draw.io, domain/range của các entry có cấu trúc, cardinality được in trực tiếp theo direct SHACL property shapes, cùng ID/reference của các tab. Property dùng chung không có domain riêng, datatype range không được in và phần diễn giải ngoài phụ lục được ghi NOT CHECKED; không được hiểu là PASS. Công cụ parse SELECT constraints nhưng không thực thi SHACL conformance, không kiểm tra calendar, snapshot, arithmetic runtime hoặc toàn bộ pipeline.</w:t>
-      </w:r>
-      <w:r>
-        <w:t xml:space="preserve"> SHACL 1.0.4 còn kiểm tra impactScore=min(1,abs(CAR)/0,10), direction theo dấu CAR với epsilon=0 và cả hai chiều inverse của Event–Candidate, Candidate–Reaction. Graph đưa vào validation phải đã có đủ inverse, được writer materialize hoặc reasoner sinh trước với provenance; validator không tự sửa graph. Reaction chỉ có onCandidate vẫn bắt buộc Candidate tương ứng REACTION_READY. Calendar, dictionary membership, strength assignment, Evidence aggregation và snapshot immutability vẫn là curated gate Phase 2.</w:t>
-      </w:r>
-      <w:r>
-        <w:t xml:space="preserve"> Baseline 1.0.4 còn ràng buộc inferenceCutoff bằng Event.availableAt và kiểm tra REACTION_READY có Reaction với literal typed xsd:string nhất quán. Audit bổ sung đối chiếu vai trò mẹ/con của hasSubsidiaryRelation tại tab 00, không nâng phạm vi thành chứng minh mọi cạnh của Draw.io.</w:t>
+        <w:t xml:space="preserve">TTL/SHACL là nguồn chuẩn khi đối chiếu property và cardinality. Công cụ tools/audit_schema_diagram.py kiểm tra inventory trong phụ lục Draw.io, domain/range của các entry có cấu trúc, cardinality được in trực tiếp theo direct SHACL property shapes, cùng ID/reference của các tab. Property dùng chung không có domain riêng, datatype range không được in và phần diễn giải ngoài phụ lục được ghi NOT CHECKED; không được hiểu là PASS. Công cụ parse SELECT constraints nhưng không thực thi SHACL conformance, không kiểm tra calendar, snapshot, arithmetic runtime hoặc toàn bộ pipeline. SHACL 1.0.5 còn kiểm tra impactScore=min(1,abs(CAR)/0,10), direction theo dấu CAR với epsilon=0 và cả hai chiều inverse của Event–Candidate, Candidate–Reaction. Graph đưa vào validation phải đã có đủ inverse, được writer materialize hoặc reasoner sinh trước với provenance; validator không tự sửa graph. Reaction chỉ có onCandidate vẫn bắt buộc Candidate tương ứng REACTION_READY. Calendar, dictionary membership, strength assignment, Evidence aggregation và snapshot immutability vẫn là curated gate Phase 2. Baseline 1.0.5 còn ràng buộc inferenceCutoff bằng Event.availableAt và kiểm tra REACTION_READY có Reaction với literal typed xsd:string nhất quán. Audit bổ sung đối chiếu vai trò mẹ/con của hasSubsidiaryRelation tại tab 00, không nâng phạm vi thành chứng minh mọi cạnh của Draw.io.</w:t>
+      </w:r>
+      <w:r>
+        <w:t xml:space="preserve"/>
+      </w:r>
+      <w:r>
+        <w:t xml:space="preserve"/>
       </w:r>
     </w:p>
     <w:p xmlns:wp14="http://schemas.microsoft.com/office/word/2010/wordml" wp14:textId="77777777">
@@ -19109,10 +19109,10 @@
           <w:rFonts w:ascii="Times New Roman" w:hAnsi="Times New Roman" w:cs="Times New Roman" w:eastAsia="Times New Roman"/>
           <w:sz w:val="26"/>
         </w:rPr>
-        <w:t>Baseline được đề xuất để đánh giá: R(i,t) = adjustedClose(i,t)/adjustedClose(i,t−1) − 1; benchmark phải có adjustedClose cùng phiên và nhất quán cách điều chỉnh. AR(i,t) = R(i,t) − R(m,t); CAR(i,[a,b]) là tổng AR theo trading day. impactScore = min(1, abs(CAR)/tau), tau = 0,10. confidenceScore = 0,25 × (sourceConfidence + extractionConfidence + linkingConfidence + relationConfidence) trong baseline đều trọng số; mọi component, tau, epsilon, window và version phải được lưu để tái lập. candidateScore = confidenceScore × relationStrength; reactionWeight = impactScore × candidateScore. Phase 2 thử tau = 0,05/0,10/0,20, các event window và exposureStrength variant trên tập phát triển/validation rồi khóa trước test.</w:t>
-      </w:r>
-      <w:r>
-        <w:t xml:space="preserve"> SHACL 1.0.4 kiểm tra baseline tau=0,10 và epsilon=0; thử tau/epsilon khác phải dùng shape/configuration được định phiên bản riêng, không chỉ đổi methodVersion.</w:t>
+        <w:t>Baseline 1.0.5: candidate identity dùng Event URI ổn định và concretePathKey của từng đường cụ thể theo EVENT_SCHEMA.md; severityScore (nếu có) thuộc [0,1]. Baseline được đề xuất để đánh giá: R(i,t) = adjustedClose(i,t)/adjustedClose(i,t−1) − 1; benchmark phải có adjustedClose cùng phiên và nhất quán cách điều chỉnh. AR(i,t) = R(i,t) − R(m,t); CAR(i,[a,b]) là tổng AR theo trading day. impactScore = min(1, abs(CAR)/tau), tau = 0,10. confidenceScore = 0,25 × (sourceConfidence + extractionConfidence + linkingConfidence + relationConfidence) trong baseline đều trọng số; mọi component, tau, epsilon, window và version phải được lưu để tái lập. candidateScore = confidenceScore × relationStrength; reactionWeight = impactScore × candidateScore. Phase 2 thử tau = 0,05/0,10/0,20, các event window và exposureStrength variant trên tập phát triển/validation rồi khóa trước test. SHACL 1.0.4 kiểm tra baseline tau=0,10 và epsilon=0; thử tau/epsilon khác phải dùng shape/configuration được định phiên bản riêng, không chỉ đổi methodVersion.</w:t>
+      </w:r>
+      <w:r>
+        <w:t xml:space="preserve"/>
       </w:r>
     </w:p>
     <w:p>
@@ -19132,7 +19132,7 @@
         <w:jc w:val="both"/>
       </w:pPr>
       <w:r>
-        <w:t>extractionConfidence lấy maximum trên Evidence hỗ trợ cùng Event và đầy đủ required roles, phù hợp role/identity assignment đã chọn, có availableAt ≤ inferenceCutoff. Nếu chỉ có điểm per-role, lấy minimum để tạo điểm assignment cho một Evidence. Assignment có căn cứ nhưng chưa calibrated dùng fallback 0,5; thiếu role không được điền fallback. Tied score chọn Evidence URI tăng dần. Không ghép các Evidence thiếu role để tạo assignment đầy đủ trong baseline; không có Evidence hợp lệ thì không sinh curated Candidate. Audit giữ tập Evidence đủ điều kiện, URI được chọn, điểm gốc, role assignment và model/calibration version. Component ablation giữ selection gốc. Chi tiết ở SCORING_SPEC.md 1.0.4.</w:t>
+        <w:t>extractionConfidence lấy maximum trên Evidence hỗ trợ cùng Event và đầy đủ required roles, phù hợp role/identity assignment đã chọn, có availableAt ≤ inferenceCutoff. Nếu chỉ có điểm per-role, lấy minimum để tạo điểm assignment cho một Evidence. Assignment có căn cứ nhưng chưa calibrated dùng fallback 0,5; thiếu role không được điền fallback. Tied score chọn Evidence URI tăng dần. Không ghép các Evidence thiếu role để tạo assignment đầy đủ trong baseline; không có Evidence hợp lệ thì không sinh curated Candidate. Audit giữ tập Evidence đủ điều kiện, URI được chọn, điểm gốc, role assignment và model/calibration version. Component ablation giữ selection gốc. Chi tiết ở SCORING_SPEC.md 1.0.5.</w:t>
       </w:r>
     </w:p>
     <w:p>
@@ -19142,7 +19142,7 @@
         <w:jc w:val="both"/>
       </w:pPr>
       <w:r>
-        <w:t>linkingConfidence dùng các quyết định của cùng Evidence/role assignment đã được selection theo extractionConfidence, không chọn lại Evidence theo linker score. Những entity/Stock suy ra qua route dùng versioned registry/temporal facts đủ điều kiện tại cutoff. Event–Company confidence lấy assignment score hỗ trợ role company trong Evidence được chọn; Company–Stock curated mapping dùng 1, automatic mapping dùng score calibrated hoặc fallback 0,5. SCORING_SPEC.md khóa bảng required inputs của bốn route và nơi lưu audit. Việc tái dùng score được công bố, không giả định các confidence component độc lập thống kê.</w:t>
+        <w:t>linkingConfidence dùng các quyết định của cùng Evidence/role assignment đã được selection theo extractionConfidence, không chọn lại Evidence theo linker score. Những entity/Stock suy ra qua route dùng versioned registry/temporal facts đủ điều kiện tại cutoff. Event–Company confidence lấy đúng điểm A của toàn bộ complete required-role assignment đã chọn, không phải điểm riêng role company hoặc linker; Event–Industry/Leader dùng cùng A; Company–Stock curated mapping dùng 1, automatic mapping dùng score calibrated hoặc fallback 0,5. SCORING_SPEC.md khóa bảng required inputs của bốn route và nơi lưu audit. Việc tái dùng score được công bố, không giả định các confidence component độc lập thống kê.</w:t>
       </w:r>
     </w:p>
     <w:tbl>
@@ -20169,7 +20169,7 @@
           <w:rFonts w:ascii="Times New Roman" w:hAnsi="Times New Roman" w:cs="Times New Roman" w:eastAsia="Times New Roman"/>
           <w:sz w:val="26"/>
         </w:rPr>
-        <w:t>Mục đích và kết quả cần kiểm tra: Cả hai Event có effectiveTradingDate 27/08/2026; trong snapshot sau window cả hai Candidate READY.</w:t>
+        <w:t>Mục đích và kết quả cần kiểm tra: Cả hai Event có effectiveTradingDate 27/08/2026; trong snapshot sau window cả hai Candidate REACTION_READY.</w:t>
       </w:r>
     </w:p>
     <w:p>
@@ -21983,7 +21983,7 @@
           <w:rFonts w:ascii="Times New Roman" w:hAnsi="Times New Roman" w:cs="Times New Roman" w:eastAsia="Times New Roman"/>
           <w:sz w:val="26"/>
         </w:rPr>
-        <w:t>Mục đích và kết quả cần kiểm tra: Mỗi Reaction truy được Stock và benchmark tại 26/08, 27/08 cùng adjustedClose, availableAt và sourceReference; phép tính lại được kiểm tra bởi runner.</w:t>
+        <w:t>Mục đích và kết quả cần kiểm tra: Mỗi Reaction truy được Stock và benchmark tại 26/08, 27/08 cùng adjustedClose, availableAt và sourceReference; runner Phase 2 cần kiểm tra phép tính lại; gói hiện chưa có runner demo để xác nhận kết quả này.</w:t>
       </w:r>
     </w:p>
     <w:p>
@@ -22351,7 +22351,7 @@
           <w:rFonts w:ascii="Times New Roman" w:hAnsi="Times New Roman" w:cs="Times New Roman" w:eastAsia="Times New Roman"/>
           <w:sz w:val="26"/>
         </w:rPr>
-        <w:t>10. Demo SPARQL/API cùng relationPath có thể giải thích và thực hiện đánh giá RQ1–RQ3.</w:t>
+        <w:t>10. Demo SPARQL/API giải thích relationPath và chạy thử evaluator RQ1–RQ3 để kiểm tra pipeline/metric. Vertical slice 100–300 bài chỉ phục vụ smoke/debug, không kết luận RQ; kết luận thực nghiệm chỉ dùng final_evaluation đã khóa.</w:t>
       </w:r>
     </w:p>
     <w:p xmlns:wp14="http://schemas.microsoft.com/office/word/2010/wordml" wp14:textId="77777777">
@@ -22387,7 +22387,7 @@
           <w:rFonts w:ascii="Times New Roman" w:hAnsi="Times New Roman" w:cs="Times New Roman" w:eastAsia="Times New Roman"/>
           <w:sz w:val="26"/>
         </w:rPr>
-        <w:t>Bộ contract 1.0.4 đã chạy ba kiểm tra độc lập. Audit tools/audit_schema_diagram.py: 337 assertion PASS, 0 FAIL, 57 NOT CHECKED, exit code 0; parse 44 SELECT constraints và xác nhận SHA256 ba input không đổi. Bộ tools/test_baseline_shacl.py: 31/31 test qua, bao gồm regression REACTION_READY typed string không có Reaction và cutoff khác Event.availableAt. Bộ tools/test_schema_diagram_audit.py: 8/8 test qua, bao gồm mutation sai vai trò công ty mẹ/con. Behavioral SHACL chạy inference=none. Các kiểm tra là synthetic structural regression, không tái tạo demo/hình lịch sử, không chứng minh calendar thật, NLP, immutability, metric executor hay RQ1–RQ3. Số audit là assertion có phạm vi, không phải phần trăm hoàn tất góp ý. PDF được xuất từ DOCX hiện hành bằng Microsoft Word; trạng thái kiểm tra layout được ghi trong PHASE1_ACCEPTANCE.md.</w:t>
+        <w:t>Contract 1.0.5 bổ sung giới hạn severityScore [0,1] và làm rõ định danh Candidate theo Event URI cùng đường cụ thể; không đổi namespace, 22 lớp hay bốn route. Kết quả kiểm tra thực thi, hash artifact và môi trường hiện hành được ghi trong PHASE1_ACCEPTANCE.md và tools/verification_contract_1.0.5.json. Các kiểm tra là synthetic structural regression; không tái tạo demo/hình lịch sử, không chứng minh calendar thật, NLP, snapshot immutability, metric executor hay RQ1–RQ3. Số audit chỉ phản ánh phạm vi assertion hỗ trợ. PDF hiện hành và giới hạn xuất/layout được nêu trong PHASE1_ACCEPTANCE.md.</w:t>
       </w:r>
     </w:p>
     <w:p xmlns:wp14="http://schemas.microsoft.com/office/word/2010/wordml" wp14:textId="77777777">
@@ -22876,7 +22876,7 @@
                 <w:rFonts w:ascii="Times New Roman" w:hAnsi="Times New Roman" w:cs="Times New Roman" w:eastAsia="Times New Roman"/>
                 <w:sz w:val="21"/>
               </w:rPr>
-              <w:t>Dictionary 1.0.4 có 14 eventType cùng vocabulary/normalization cho role tham gia key và chính sách HOLD khi chưa chuẩn hóa. Chất lượng annotation, extraction và identity resolution phải đánh giá ở Phase 2.</w:t>
+              <w:t>Dictionary contract 1.0.5 giữ nguyên vocabulary/normalization 1.0.4; có 14 eventType cùng quy tắc vai trò/key và chính sách HOLD khi chưa chuẩn hóa. Chất lượng annotation, extraction và identity resolution phải đánh giá ở Phase 2.</w:t>
             </w:r>
           </w:p>
         </w:tc>
@@ -23143,7 +23143,7 @@
           <w:rFonts w:ascii="Times New Roman" w:hAnsi="Times New Roman" w:cs="Times New Roman" w:eastAsia="Times New Roman"/>
           <w:sz w:val="26"/>
         </w:rPr>
-        <w:t>Các đường suy luận ngoài bốn baseline phải được đánh dấu rõ: FUTURE EXTENSION — NOT IMPLEMENTED IN PHASE 2 BASELINE. Trong baseline 1.0.4, relationPath phải bằng impactType. Draw.io được đối chiếu theo contract TTL/SHACL và chỉ minh họa bốn baseline path; TTL/SHACL vẫn là source of truth.</w:t>
+        <w:t>Các đường suy luận ngoài bốn baseline phải được đánh dấu rõ: FUTURE EXTENSION — NOT IMPLEMENTED IN PHASE 2 BASELINE. Trong baseline 1.0.5, relationPath phải bằng impactType. Draw.io được đối chiếu theo contract TTL/SHACL và chỉ minh họa bốn baseline path; TTL/SHACL vẫn là source of truth.</w:t>
       </w:r>
     </w:p>
     <w:p>

</xml_diff>

<commit_message>
Finalize Phase 1 scoring sync package
</commit_message>
<xml_diff>
--- a/chỉnh sửa mới nhất - 01-10/Bao_cao_Phase_1_Ontology_WFKG_ban_chot_da_dong_bo_hieu_dinh.docx
+++ b/chỉnh sửa mới nhất - 01-10/Bao_cao_Phase_1_Ontology_WFKG_ban_chot_da_dong_bo_hieu_dinh.docx
@@ -311,7 +311,7 @@
           <w:rFonts w:ascii="Times New Roman" w:hAnsi="Times New Roman" w:cs="Times New Roman" w:eastAsia="Times New Roman"/>
           <w:sz w:val="26"/>
         </w:rPr>
-        <w:t xml:space="preserve">Ontology gồm 22 lớp: 18 lớp nghiệp vụ và 4 lớp biểu diễn quan hệ theo thời gian. Bank là lớp con của Company. Tên thống nhất là WFKG; namespace wfkg: &lt;https://example.org/wfkg/v1#&gt;. Trong gói này, ontology_v1.0.ttl và shapes_v1.0.ttl là nguồn chuẩn về schema; bảng trong báo cáo được rà theo các contract đó. Gói có tools/audit_schema_diagram.py và tools/README.md để kiểm tra chỉ đọc sự nhất quán của phụ lục Draw.io với TTL/SHACL. Công cụ không tự sửa hoặc dựng lại bảng, báo cáo hay sơ đồ. Phiên bản contract hiệu đính là 1.0.5; giữ nguyên tên ontology_v1.0.ttl và shapes_v1.0.ttl, namespace và 22 lớp. Phiên bản tăng để không gán quy tắc mới cho kết quả snapshot cũ.</w:t>
+        <w:t xml:space="preserve">Ontology gồm 22 lớp: 18 lớp nghiệp vụ và 4 lớp biểu diễn quan hệ theo thời gian. Bank là lớp con của Company. Tên thống nhất là WFKG; namespace wfkg: &lt;https://example.org/wfkg/v1#&gt;. Trong gói này, ontology_v1.0.ttl và shapes_v1.0.ttl là nguồn chuẩn về schema; bảng trong báo cáo được rà theo các contract đó. Gói có tools/audit_schema_diagram.py và tools/README.md để kiểm tra chỉ đọc sự nhất quán của phụ lục Draw.io với TTL/SHACL. Công cụ không tự sửa hoặc dựng lại bảng, báo cáo hay sơ đồ. Structural ontology/SHACL contract là 1.0.5; WFKG-SCORE-V1 specification là 1.1.0; giữ nguyên tên ontology_v1.0.ttl và shapes_v1.0.ttl, namespace và 22 lớp. Phiên bản tăng để không gán quy tắc mới cho kết quả snapshot cũ.</w:t>
       </w:r>
       <w:r>
         <w:t xml:space="preserve"/>
@@ -1332,7 +1332,7 @@
           <w:rFonts w:ascii="Times New Roman" w:hAnsi="Times New Roman" w:cs="Times New Roman" w:eastAsia="Times New Roman"/>
           <w:sz w:val="26"/>
         </w:rPr>
-        <w:t>Các tình huống ngành, chính sách và doanh nghiệp đều phải đi qua quy tắc liên kết được định phiên bản; không tự coi các doanh nghiệp cùng ngành là có exposure bằng nhau. Các đường ngoài bốn baseline là FUTURE EXTENSION — NOT IMPLEMENTED IN PHASE 2 BASELINE. Trong baseline 1.0.5, relationPath là mã route ổn định và phải bằng impactType; các mũi tên trong bảng chỉ mô tả topology. Không lưu chuỗi URI/property/phiên bản quan hệ vào relationPath; candidateReason giải thích việc chọn Candidate, còn các quan hệ và provenance được biểu diễn bằng liên kết RDF và relation node tương ứng.</w:t>
+        <w:t>Các tình huống ngành, chính sách và doanh nghiệp đều phải đi qua quy tắc liên kết được định phiên bản; không tự coi các doanh nghiệp cùng ngành là có exposure bằng nhau. Các đường ngoài bốn baseline là FUTURE EXTENSION — NOT IMPLEMENTED IN PHASE 2 BASELINE. Trong WFKG-SCORE-V1 (SCORING_SPEC.md 1.1.0; structural contract 1.0.5), relationPath là mã route ổn định và phải bằng impactType; các mũi tên trong bảng chỉ mô tả topology. Không lưu chuỗi URI/property/phiên bản quan hệ vào relationPath; candidateReason giải thích việc chọn Candidate, còn các quan hệ và provenance được biểu diễn bằng liên kết RDF và relation node tương ứng.</w:t>
       </w:r>
     </w:p>
     <w:p xmlns:wp14="http://schemas.microsoft.com/office/word/2010/wordml" wp14:textId="77777777">
@@ -11855,7 +11855,7 @@
                 <w:rFonts w:ascii="Times New Roman" w:hAnsi="Times New Roman" w:cs="Times New Roman" w:eastAsia="Times New Roman"/>
                 <w:sz w:val="21"/>
               </w:rPr>
-              <w:t>Baseline: DIRECT=1; INDIRECT_INDUSTRY=0,5; INDIRECT_SUBSIDIARY=0,5; INDIRECT_LEADERSHIP=0,5. Đây là heuristic độc lập market reaction. Biến thể industry dùng exposureStrength=exposureRatio đã chuẩn hóa trên cùng tập exposure hợp lệ.</w:t>
+              <w:t>WFKG-SCORE-V1 route rule: T=relationStrength: DIRECT=1.0; INDIRECT_INDUSTRY=0.5; INDIRECT_SUBSIDIARY=0.5; INDIRECT_LEADERSHIP=0.5. Separate components: S=sourceConfidence=0.5; R=min(required path edge supports), with automatic evidenced support=0.5 and eligible curated support=1.0. The INDUSTRY exposureStrength=exposureRatio comparison is a separately versioned Phase 2 experiment after AUTOMATIC_VERTICAL_SLICE; other route strengths and baseline inputs stay fixed.</w:t>
             </w:r>
           </w:p>
         </w:tc>
@@ -12089,7 +12089,7 @@
                 <w:rFonts w:ascii="Times New Roman" w:hAnsi="Times New Roman" w:cs="Times New Roman" w:eastAsia="Times New Roman"/>
                 <w:sz w:val="21"/>
               </w:rPr>
-              <w:t>Baseline 1.0.5 khóa inferenceCutoff = Event.availableAt, trước opening day 0. Chỉ dùng Evidence, dữ liệu và phiên bản quan hệ đã khả dụng tại mốc này. generatedAt có thể muộn hơn khi replay, nhưng không được lấy thêm thông tin sau cutoff.</w:t>
+              <w:t>WFKG-SCORE-V1 (spec 1.1.0; structural contract 1.0.5) khóa inferenceCutoff = Event.availableAt, trước opening day 0. Chỉ dùng Evidence, dữ liệu và phiên bản quan hệ đã khả dụng tại mốc này. generatedAt có thể muộn hơn khi replay, nhưng không được lấy thêm thông tin sau cutoff.</w:t>
             </w:r>
           </w:p>
         </w:tc>
@@ -12713,7 +12713,7 @@
                 <w:rFonts w:ascii="Times New Roman" w:hAnsi="Times New Roman" w:cs="Times New Roman" w:eastAsia="Times New Roman"/>
                 <w:sz w:val="21"/>
               </w:rPr>
-              <w:t>Maximum điểm Evidence đủ điều kiện tại cutoff và hỗ trợ đầy đủ required roles; tie-break Evidence URI tăng dần. Nếu chỉ có điểm theo role thì lấy minimum cho một assignment. Thiếu calibration dùng fallback 0,5 có provenance; thiếu required role thì loại. Freeze Evidence được chọn và điểm gốc; không cộng điểm nhiều bài.</w:t>
+              <w:t>V1 dùng task scores của extractor đã fine-tune cho các quyết định neural bắt buộc; assignmentScore là minimum của các quyết định đó. Thiếu hoặc sai score là producer error, không gán fallback 0.5. Chỉ assignment đầy đủ và đủ điều kiện tại cutoff mới được chọn; tie-break Evidence URI tăng dần. Freeze Evidence được chọn, role assignment, điểm gốc và model/config version.</w:t>
             </w:r>
           </w:p>
         </w:tc>
@@ -12869,7 +12869,7 @@
                 <w:rFonts w:ascii="Times New Roman" w:hAnsi="Times New Roman" w:cs="Times New Roman" w:eastAsia="Times New Roman"/>
                 <w:sz w:val="21"/>
               </w:rPr>
-              <w:t>Minimum required path-link confidence; Event–Company dùng required-role assignment score của Evidence đã chọn. Company–Stock curated registry dùng 1, automatic mapping dùng calibrated score hoặc fallback 0,5 có provenance. Không giả định các component độc lập.</w:t>
+              <w:t>Linking confidence L là minimum của các quyết định link bắt buộc trong assignment đã chọn. Chỉ exact identifier, normalized canonical name hoặc registered alias phân giải duy nhất tới đúng entity type mới được nhận với decisionScore=1.0; fuzzy-only, ambiguous hoặc thiếu mapping phải HOLD/suppress, không fallback. Relation confidence R được tính riêng bằng minimum edge support trên path: automatic evidenced=0.5, curated structured hợp lệ=1.0; Event-entry automatic support không phải extraction score A hay linker score L.</w:t>
             </w:r>
           </w:p>
         </w:tc>
@@ -18314,7 +18314,7 @@
           <w:rFonts w:ascii="Times New Roman" w:hAnsi="Times New Roman" w:cs="Times New Roman" w:eastAsia="Times New Roman"/>
           <w:sz w:val="26"/>
         </w:rPr>
-        <w:t>inferenceCutoff lưu trên Candidate là mốc chọn thông tin đầu vào; generatedAt là thời điểm thực thi. Candidate chỉ dùng Evidence và fact khả dụng tại inferenceCutoff, đồng thời cố định confidenceScore và relationStrength theo snapshot này. Baseline 1.0.5 khóa cutoff đúng bằng Event.availableAt, là mốc Evidence sớm nhất hỗ trợ Event, và nhỏ hơn opening day 0. Nếu tại cutoff chưa có complete assignment hay mapping đủ điều kiện, baseline không sinh Candidate; phải ghi coverage/miss, không dời cutoff hoặc loại Event khỏi gold để làm đẹp recall. Replay muộn chỉ tái lập thông tin khả dụng ở cutoff, không phải bằng chứng đã dự đoán trực tiếp lúc đó.</w:t>
+        <w:t>inferenceCutoff lưu trên Candidate là mốc chọn thông tin đầu vào; generatedAt là thời điểm thực thi. Candidate chỉ dùng Evidence và fact khả dụng tại inferenceCutoff, đồng thời cố định confidenceScore và relationStrength theo snapshot này. WFKG-SCORE-V1 (spec 1.1.0; structural contract 1.0.5) khóa cutoff đúng bằng Event.availableAt, là mốc Evidence sớm nhất hỗ trợ Event, và nhỏ hơn opening day 0. Nếu tại cutoff chưa có complete assignment hay mapping đủ điều kiện, baseline không sinh Candidate; phải ghi coverage/miss, không dời cutoff hoặc loại Event khỏi gold để làm đẹp recall. Replay muộn chỉ tái lập thông tin khả dụng ở cutoff, không phải bằng chứng đã dự đoán trực tiếp lúc đó.</w:t>
       </w:r>
       <w:r>
         <w:t xml:space="preserve"/>
@@ -19039,7 +19039,7 @@
           <w:rFonts w:ascii="Times New Roman" w:hAnsi="Times New Roman" w:cs="Times New Roman" w:eastAsia="Times New Roman"/>
           <w:sz w:val="26"/>
         </w:rPr>
-        <w:t xml:space="preserve">TTL/SHACL là nguồn chuẩn khi đối chiếu property và cardinality. Công cụ tools/audit_schema_diagram.py kiểm tra inventory trong phụ lục Draw.io, domain/range của các entry có cấu trúc, cardinality được in trực tiếp theo direct SHACL property shapes, cùng ID/reference của các tab. Property dùng chung không có domain riêng, datatype range không được in và phần diễn giải ngoài phụ lục được ghi NOT CHECKED; không được hiểu là PASS. Công cụ parse SELECT constraints nhưng không thực thi SHACL conformance, không kiểm tra calendar, snapshot, arithmetic runtime hoặc toàn bộ pipeline. SHACL 1.0.5 còn kiểm tra impactScore=min(1,abs(CAR)/0,10), direction theo dấu CAR với epsilon=0 và cả hai chiều inverse của Event–Candidate, Candidate–Reaction. Graph đưa vào validation phải đã có đủ inverse, được writer materialize hoặc reasoner sinh trước với provenance; validator không tự sửa graph. Reaction chỉ có onCandidate vẫn bắt buộc Candidate tương ứng REACTION_READY. Calendar, dictionary membership, strength assignment, Evidence aggregation và snapshot immutability vẫn là curated gate Phase 2. Baseline 1.0.5 còn ràng buộc inferenceCutoff bằng Event.availableAt và kiểm tra REACTION_READY có Reaction với literal typed xsd:string nhất quán. Audit bổ sung đối chiếu vai trò mẹ/con của hasSubsidiaryRelation tại tab 00, không nâng phạm vi thành chứng minh mọi cạnh của Draw.io.</w:t>
+        <w:t xml:space="preserve">TTL/SHACL là nguồn chuẩn khi đối chiếu property và cardinality. Công cụ tools/audit_schema_diagram.py kiểm tra inventory trong phụ lục Draw.io, domain/range của các entry có cấu trúc, cardinality được in trực tiếp theo direct SHACL property shapes, cùng ID/reference của các tab. Property dùng chung không có domain riêng, datatype range không được in và phần diễn giải ngoài phụ lục được ghi NOT CHECKED; không được hiểu là PASS. Công cụ parse SELECT constraints nhưng không thực thi SHACL conformance, không kiểm tra calendar, snapshot, arithmetic runtime hoặc toàn bộ pipeline. SHACL 1.0.5 còn kiểm tra impactScore=min(1,abs(CAR)/0,10), direction theo dấu CAR với epsilon=0 và cả hai chiều inverse của Event–Candidate, Candidate–Reaction. Graph đưa vào validation phải đã có đủ inverse, được writer materialize hoặc reasoner sinh trước với provenance; validator không tự sửa graph. Reaction chỉ có onCandidate vẫn bắt buộc Candidate tương ứng REACTION_READY. Calendar, dictionary membership, V1 route-strength/origin enforcement, Evidence aggregation và snapshot immutability vẫn là curated gate Phase 2. Baseline WFKG-SCORE-V1 còn ràng buộc inferenceCutoff bằng Event.availableAt và kiểm tra REACTION_READY có Reaction với literal typed xsd:string nhất quán. Audit bổ sung đối chiếu vai trò mẹ/con của hasSubsidiaryRelation tại tab 00, không nâng phạm vi thành chứng minh mọi cạnh của Draw.io.</w:t>
       </w:r>
       <w:r>
         <w:t xml:space="preserve"/>
@@ -19109,7 +19109,7 @@
           <w:rFonts w:ascii="Times New Roman" w:hAnsi="Times New Roman" w:cs="Times New Roman" w:eastAsia="Times New Roman"/>
           <w:sz w:val="26"/>
         </w:rPr>
-        <w:t>Baseline 1.0.5: candidate identity dùng Event URI ổn định và concretePathKey của từng đường cụ thể theo EVENT_SCHEMA.md; severityScore (nếu có) thuộc [0,1]. Baseline được đề xuất để đánh giá: R(i,t) = adjustedClose(i,t)/adjustedClose(i,t−1) − 1; benchmark phải có adjustedClose cùng phiên và nhất quán cách điều chỉnh. AR(i,t) = R(i,t) − R(m,t); CAR(i,[a,b]) là tổng AR theo trading day. impactScore = min(1, abs(CAR)/tau), tau = 0,10. confidenceScore = 0,25 × (sourceConfidence + extractionConfidence + linkingConfidence + relationConfidence) trong baseline đều trọng số; mọi component, tau, epsilon, window và version phải được lưu để tái lập. candidateScore = confidenceScore × relationStrength; reactionWeight = impactScore × candidateScore. Phase 2 thử tau = 0,05/0,10/0,20, các event window và exposureStrength variant trên tập phát triển/validation rồi khóa trước test. SHACL 1.0.4 kiểm tra baseline tau=0,10 và epsilon=0; thử tau/epsilon khác phải dùng shape/configuration được định phiên bản riêng, không chỉ đổi methodVersion.</w:t>
+        <w:t>WFKG-SCORE-V1 (SCORING_SPEC.md 1.1.0; structural contract 1.0.5): candidate identity dùng Event URI ổn định và concretePathKey của từng đường cụ thể theo EVENT_SCHEMA.md; severityScore (nếu có) thuộc [0,1]. Baseline được đề xuất để đánh giá: R(i,t) = adjustedClose(i,t)/adjustedClose(i,t−1) − 1; benchmark phải có adjustedClose cùng phiên và nhất quán cách điều chỉnh. AR(i,t) = R(i,t) − R(m,t); CAR(i,[a,b]) là tổng AR theo trading day. impactScore = min(1, abs(CAR)/tau), tau = 0,10. confidenceScore = 0,25 × (sourceConfidence + extractionConfidence + linkingConfidence + relationConfidence) trong baseline đều trọng số; mọi component, tau, epsilon, window và version phải được lưu để tái lập. candidateScore = confidenceScore × relationStrength; reactionWeight = impactScore × candidateScore. Phase 2 thử tau = 0,05/0,10/0,20, các event window và exposureStrength variant trên tập phát triển/validation rồi khóa trước test. SHACL 1.0.5 kiểm tra baseline tau=0,10 và epsilon=0; thử tau/epsilon khác phải dùng shape/configuration được định phiên bản riêng, không chỉ đổi methodVersion.</w:t>
       </w:r>
       <w:r>
         <w:t xml:space="preserve"/>
@@ -19122,7 +19122,7 @@
         <w:jc w:val="both"/>
       </w:pPr>
       <w:r>
-        <w:t>Scoring đã khóa: relationStrength DIRECT=1; ba path gián tiếp=0,5. Biến thể industry chỉ thay strength bằng exposureStrength=exposureRatio đã chuẩn hóa, không đổi population, Evidence selection hoặc strength của các path khác. Các hằng số là heuristic thực nghiệm, không phải mức ảnh hưởng kinh tế đo được.</w:t>
+        <w:t>Scoring đã khóa: T=relationStrength theo route: DIRECT=1.0; INDIRECT_INDUSTRY=0.5; INDIRECT_SUBSIDIARY=0.5; INDIRECT_LEADERSHIP=0.5. S=sourceConfidence=0.5 và R=min(required edge supports), với automatic=0.5/curated=1.0, là các thành phần riêng. Biến thể Phase 2 chỉ thay T của INDUSTRY bằng exposureStrength=exposureRatio đã chuẩn hóa trên tập hợp lệ; giữ nguyên các route khác, population và Evidence selection.</w:t>
       </w:r>
     </w:p>
     <w:p>
@@ -19132,7 +19132,7 @@
         <w:jc w:val="both"/>
       </w:pPr>
       <w:r>
-        <w:t>extractionConfidence lấy maximum trên Evidence hỗ trợ cùng Event và đầy đủ required roles, phù hợp role/identity assignment đã chọn, có availableAt ≤ inferenceCutoff. Nếu chỉ có điểm per-role, lấy minimum để tạo điểm assignment cho một Evidence. Assignment có căn cứ nhưng chưa calibrated dùng fallback 0,5; thiếu role không được điền fallback. Tied score chọn Evidence URI tăng dần. Không ghép các Evidence thiếu role để tạo assignment đầy đủ trong baseline; không có Evidence hợp lệ thì không sinh curated Candidate. Audit giữ tập Evidence đủ điều kiện, URI được chọn, điểm gốc, role assignment và model/calibration version. Component ablation giữ selection gốc. Chi tiết ở SCORING_SPEC.md 1.0.5.</w:t>
+        <w:t>extractionConfidence lấy maximum trên Evidence hỗ trợ cùng Event và đầy đủ required roles, phù hợp role/identity assignment đã chọn, có availableAt ≤ inferenceCutoff. Nếu chỉ có điểm per-role, lấy minimum để tạo điểm assignment cho một Evidence. Score assignment thiếu hoặc không hợp lệ là lỗi producer; V1 không dùng fallback 0,5. Thiếu required role thì không có complete assignment. Tied score chọn Evidence URI tăng dần. Không ghép các Evidence thiếu role để tạo assignment đầy đủ trong baseline; không có Evidence hợp lệ thì không sinh curated Candidate. Audit giữ tập Evidence đủ điều kiện, URI được chọn, điểm gốc, role assignment và model/calibration version. Component ablation giữ selection gốc. Chi tiết ở SCORING_SPEC.md 1.1.0.</w:t>
       </w:r>
     </w:p>
     <w:p>
@@ -19142,7 +19142,7 @@
         <w:jc w:val="both"/>
       </w:pPr>
       <w:r>
-        <w:t>linkingConfidence dùng các quyết định của cùng Evidence/role assignment đã được selection theo extractionConfidence, không chọn lại Evidence theo linker score. Những entity/Stock suy ra qua route dùng versioned registry/temporal facts đủ điều kiện tại cutoff. Event–Company confidence lấy đúng điểm A của toàn bộ complete required-role assignment đã chọn, không phải điểm riêng role company hoặc linker; Event–Industry/Leader dùng cùng A; Company–Stock curated mapping dùng 1, automatic mapping dùng score calibrated hoặc fallback 0,5. SCORING_SPEC.md khóa bảng required inputs của bốn route và nơi lưu audit. Việc tái dùng score được công bố, không giả định các confidence component độc lập thống kê.</w:t>
+        <w:t>linkingConfidence dùng các quyết định của cùng Evidence/role assignment đã được selection theo extractionConfidence, không chọn lại Evidence theo linker score. Những entity/Stock suy ra qua route dùng versioned registry/temporal facts đủ điều kiện tại cutoff. Event–Company/Industry/Leader automatic relation support được gán 0,5 và đi vào R, không lấy điểm A hay L. Link L chỉ nhận exact typed unique registry matches với decisionScore=1,0; ambiguous/fuzzy-only/absent HOLD, không fallback. Company–Stock curated relation support hợp lệ là 1,0; R là minimum support trên toàn path. SCORING_SPEC.md khóa bảng required inputs của bốn route và nơi lưu audit. Việc tái dùng score được công bố, không giả định các confidence component độc lập thống kê.</w:t>
       </w:r>
     </w:p>
     <w:tbl>
@@ -22387,7 +22387,7 @@
           <w:rFonts w:ascii="Times New Roman" w:hAnsi="Times New Roman" w:cs="Times New Roman" w:eastAsia="Times New Roman"/>
           <w:sz w:val="26"/>
         </w:rPr>
-        <w:t>Contract 1.0.5 bổ sung giới hạn severityScore [0,1] và làm rõ định danh Candidate theo Event URI cùng đường cụ thể; không đổi namespace, 22 lớp hay bốn route. Kết quả kiểm tra thực thi, hash artifact và môi trường hiện hành được ghi trong PHASE1_ACCEPTANCE.md và tools/verification_contract_1.0.5.json. Các kiểm tra là synthetic structural regression; không tái tạo demo/hình lịch sử, không chứng minh calendar thật, NLP, snapshot immutability, metric executor hay RQ1–RQ3. Số audit chỉ phản ánh phạm vi assertion hỗ trợ. PDF hiện hành và giới hạn xuất/layout được nêu trong PHASE1_ACCEPTANCE.md.</w:t>
+        <w:t>Structural contract 1.0.5 giữ nguyên namespace, 22 lớp và bốn route. WFKG-SCORE-V1 scoring rules được đồng bộ trong SCORING_SPEC.md 1.1.0, Word và Draw.io. Các kết quả trong tools/verification_contract_1.0.5.json là lịch sử trước lần đồng bộ này; trạng thái kiểm tra hiện tại và hash được ghi tại tools/phase1_package_manifest_1.1.0.json. Regression đồng bộ tài liệu không chứng minh SHACL, NLP, calendar thật, snapshot runtime hay RQ1–RQ3; các kiểm tra RDF hiện cần môi trường có rdflib/pyshacl. PDF hiện hành vẫn chờ xuất từ Word và kiểm tra layout.</w:t>
       </w:r>
     </w:p>
     <w:p xmlns:wp14="http://schemas.microsoft.com/office/word/2010/wordml" wp14:textId="77777777">
@@ -23143,7 +23143,7 @@
           <w:rFonts w:ascii="Times New Roman" w:hAnsi="Times New Roman" w:cs="Times New Roman" w:eastAsia="Times New Roman"/>
           <w:sz w:val="26"/>
         </w:rPr>
-        <w:t>Các đường suy luận ngoài bốn baseline phải được đánh dấu rõ: FUTURE EXTENSION — NOT IMPLEMENTED IN PHASE 2 BASELINE. Trong baseline 1.0.5, relationPath phải bằng impactType. Draw.io được đối chiếu theo contract TTL/SHACL và chỉ minh họa bốn baseline path; TTL/SHACL vẫn là source of truth.</w:t>
+        <w:t>Các đường suy luận ngoài bốn baseline phải được đánh dấu rõ: FUTURE EXTENSION — NOT IMPLEMENTED IN PHASE 2 BASELINE. Trong WFKG-SCORE-V1 (SCORING_SPEC.md 1.1.0; structural contract 1.0.5), relationPath phải bằng impactType. Draw.io được đối chiếu theo contract TTL/SHACL và chỉ minh họa bốn baseline path; TTL/SHACL vẫn là source of truth.</w:t>
       </w:r>
     </w:p>
     <w:p>

</xml_diff>